<commit_message>
Update client walkThrough requirements
</commit_message>
<xml_diff>
--- a/Requirements/clientWalkThrough.docx
+++ b/Requirements/clientWalkThrough.docx
@@ -32,7 +32,7 @@
           <w:sz w:val="28"/>
           <w:lang w:val="en-US"/>
         </w:rPr>
-        <w:t xml:space="preserve">Our client’s name is Lisa Geoffrey. She’s a student in China. She lives in Hong Kong. She’s currently in university level. She’s a great business woman owning various productive businesses in Tanzania mainland as well as international wise in various countries. </w:t>
+        <w:t xml:space="preserve">Our client’s name is Lisa Geoffrey. She’s a student in China. She lives in Hong Kong. She’s currently in university level. She’s a great business woman owning various productive business in Tanzania mainland as well as international wise in various countries. </w:t>
       </w:r>
     </w:p>
     <w:p>
@@ -65,7 +65,209 @@
           <w:sz w:val="28"/>
           <w:lang w:val="en-US"/>
         </w:rPr>
-        <w:t>Lisa says that over the years, she’s been prosperous in her business</w:t>
+        <w:t xml:space="preserve">Lisa says that over the years, she’s been </w:t>
+      </w:r>
+      <w:r>
+        <w:rPr>
+          <w:rFonts w:ascii="Book Antiqua" w:hAnsi="Book Antiqua"/>
+          <w:sz w:val="28"/>
+          <w:lang w:val="en-US"/>
+        </w:rPr>
+        <w:t xml:space="preserve">operating a product-ordering business from China, where she helps small-scale sellers obtain products from different countries without requiring them to travel themselves. She manages a large group of sellers through WhatsApp, where sellers communicate their product requests and place orders. However, Lisa currently relies on handwritten records and WhatsApp conversations to manage sellers, products and orders. </w:t>
+      </w:r>
+    </w:p>
+    <w:p>
+      <w:pPr>
+        <w:pStyle w:val="Heading3"/>
+        <w:rPr>
+          <w:rFonts w:ascii="Book Antiqua" w:hAnsi="Book Antiqua"/>
+          <w:sz w:val="32"/>
+          <w:lang w:val="en-US"/>
+        </w:rPr>
+      </w:pPr>
+      <w:r>
+        <w:rPr>
+          <w:rFonts w:ascii="Book Antiqua" w:hAnsi="Book Antiqua"/>
+          <w:sz w:val="32"/>
+          <w:lang w:val="en-US"/>
+        </w:rPr>
+        <w:t>Business process challenges facing client’s business</w:t>
+      </w:r>
+    </w:p>
+    <w:p>
+      <w:pPr>
+        <w:rPr>
+          <w:rFonts w:ascii="Book Antiqua" w:hAnsi="Book Antiqua"/>
+          <w:sz w:val="28"/>
+          <w:lang w:val="en-US"/>
+        </w:rPr>
+      </w:pPr>
+      <w:r>
+        <w:rPr>
+          <w:rFonts w:ascii="Book Antiqua" w:hAnsi="Book Antiqua"/>
+          <w:sz w:val="28"/>
+          <w:lang w:val="en-US"/>
+        </w:rPr>
+        <w:t>Lisa says that a</w:t>
+      </w:r>
+      <w:r>
+        <w:rPr>
+          <w:rFonts w:ascii="Book Antiqua" w:hAnsi="Book Antiqua"/>
+          <w:sz w:val="28"/>
+          <w:lang w:val="en-US"/>
+        </w:rPr>
+        <w:t>s the number of sellers, products and orders increases, it becomes difficult to accurately record, retrieve, organize and track orders and their history.</w:t>
+      </w:r>
+    </w:p>
+    <w:p>
+      <w:pPr>
+        <w:rPr>
+          <w:rFonts w:ascii="Book Antiqua" w:hAnsi="Book Antiqua"/>
+          <w:sz w:val="28"/>
+          <w:lang w:val="en-US"/>
+        </w:rPr>
+      </w:pPr>
+      <w:r>
+        <w:rPr>
+          <w:rFonts w:ascii="Book Antiqua" w:hAnsi="Book Antiqua"/>
+          <w:sz w:val="28"/>
+          <w:lang w:val="en-US"/>
+        </w:rPr>
+        <w:t>So, Lisa wants us to make her an app that will help her digitally manage and track orders placed by multiple sellers in an organized, reliable, and easily retrievable way.</w:t>
+      </w:r>
+    </w:p>
+    <w:p>
+      <w:pPr>
+        <w:rPr>
+          <w:lang w:val="en-US"/>
+        </w:rPr>
+      </w:pPr>
+    </w:p>
+    <w:p>
+      <w:pPr>
+        <w:rPr>
+          <w:rFonts w:ascii="Book Antiqua" w:hAnsi="Book Antiqua"/>
+          <w:color w:val="FF0000"/>
+          <w:sz w:val="28"/>
+          <w:lang w:val="en-US"/>
+        </w:rPr>
+      </w:pPr>
+      <w:r>
+        <w:rPr>
+          <w:rFonts w:ascii="Book Antiqua" w:hAnsi="Book Antiqua"/>
+          <w:color w:val="FF0000"/>
+          <w:sz w:val="28"/>
+          <w:lang w:val="en-US"/>
+        </w:rPr>
+        <w:t>Suggested business solution to the problem.</w:t>
+      </w:r>
+    </w:p>
+    <w:p>
+      <w:pPr>
+        <w:rPr>
+          <w:rFonts w:ascii="Book Antiqua" w:hAnsi="Book Antiqua"/>
+          <w:sz w:val="28"/>
+          <w:lang w:val="en-US"/>
+        </w:rPr>
+      </w:pPr>
+      <w:r>
+        <w:rPr>
+          <w:rFonts w:ascii="Book Antiqua" w:hAnsi="Book Antiqua"/>
+          <w:sz w:val="28"/>
+          <w:lang w:val="en-US"/>
+        </w:rPr>
+        <w:t>The app should enable Lisa who is the administrator to: register sellers, record/receive orders, add product information, update order status, search order history and view seller records.</w:t>
+      </w:r>
+    </w:p>
+    <w:p>
+      <w:pPr>
+        <w:rPr>
+          <w:rFonts w:ascii="Book Antiqua" w:hAnsi="Book Antiqua"/>
+          <w:sz w:val="28"/>
+          <w:lang w:val="en-US"/>
+        </w:rPr>
+      </w:pPr>
+      <w:r>
+        <w:rPr>
+          <w:rFonts w:ascii="Book Antiqua" w:hAnsi="Book Antiqua"/>
+          <w:sz w:val="28"/>
+          <w:lang w:val="en-US"/>
+        </w:rPr>
+        <w:t>While on the seller’s side, the app should enable sellers/customers to: place order, provide product requirements, view their order information/status and check previous orders.</w:t>
+      </w:r>
+    </w:p>
+    <w:p>
+      <w:pPr>
+        <w:rPr>
+          <w:rFonts w:ascii="Book Antiqua" w:hAnsi="Book Antiqua"/>
+          <w:sz w:val="28"/>
+          <w:lang w:val="en-US"/>
+        </w:rPr>
+      </w:pPr>
+      <w:r>
+        <w:rPr>
+          <w:rFonts w:ascii="Book Antiqua" w:hAnsi="Book Antiqua"/>
+          <w:sz w:val="28"/>
+          <w:lang w:val="en-US"/>
+        </w:rPr>
+        <w:t>The process would be as follows:</w:t>
+      </w:r>
+    </w:p>
+    <w:p>
+      <w:pPr>
+        <w:rPr>
+          <w:rFonts w:ascii="Book Antiqua" w:hAnsi="Book Antiqua"/>
+          <w:sz w:val="28"/>
+          <w:lang w:val="en-US"/>
+        </w:rPr>
+      </w:pPr>
+      <w:r>
+        <w:rPr>
+          <w:rFonts w:ascii="Book Antiqua" w:hAnsi="Book Antiqua"/>
+          <w:sz w:val="28"/>
+          <w:lang w:val="en-US"/>
+        </w:rPr>
+        <w:t xml:space="preserve">Seller </w:t>
+      </w:r>
+      <w:r>
+        <w:rPr>
+          <w:rFonts w:ascii="Book Antiqua" w:hAnsi="Book Antiqua"/>
+          <w:sz w:val="28"/>
+          <w:lang w:val="en-US"/>
+        </w:rPr>
+        <w:sym w:font="Wingdings" w:char="F0E0"/>
+      </w:r>
+      <w:r>
+        <w:rPr>
+          <w:rFonts w:ascii="Book Antiqua" w:hAnsi="Book Antiqua"/>
+          <w:sz w:val="28"/>
+          <w:lang w:val="en-US"/>
+        </w:rPr>
+        <w:t xml:space="preserve"> login </w:t>
+      </w:r>
+      <w:r>
+        <w:rPr>
+          <w:rFonts w:ascii="Book Antiqua" w:hAnsi="Book Antiqua"/>
+          <w:sz w:val="28"/>
+          <w:lang w:val="en-US"/>
+        </w:rPr>
+        <w:sym w:font="Wingdings" w:char="F0E0"/>
+      </w:r>
+      <w:r>
+        <w:rPr>
+          <w:rFonts w:ascii="Book Antiqua" w:hAnsi="Book Antiqua"/>
+          <w:sz w:val="28"/>
+          <w:lang w:val="en-US"/>
+        </w:rPr>
+        <w:t xml:space="preserve"> Place order </w:t>
+      </w:r>
+      <w:r>
+        <w:rPr>
+          <w:rFonts w:ascii="Book Antiqua" w:hAnsi="Book Antiqua"/>
+          <w:sz w:val="28"/>
+          <w:lang w:val="en-US"/>
+        </w:rPr>
+        <w:sym w:font="Wingdings" w:char="F0E0"/>
       </w:r>
       <w:r>
         <w:rPr>
@@ -75,299 +277,6 @@
         </w:rPr>
         <w:t xml:space="preserve"> </w:t>
       </w:r>
-      <w:r>
-        <w:rPr>
-          <w:rFonts w:ascii="Book Antiqua" w:hAnsi="Book Antiqua"/>
-          <w:sz w:val="28"/>
-          <w:lang w:val="en-US"/>
-        </w:rPr>
-        <w:t>in terms</w:t>
-      </w:r>
-      <w:r>
-        <w:rPr>
-          <w:rFonts w:ascii="Book Antiqua" w:hAnsi="Book Antiqua"/>
-          <w:sz w:val="28"/>
-          <w:lang w:val="en-US"/>
-        </w:rPr>
-        <w:t xml:space="preserve"> of </w:t>
-      </w:r>
-      <w:r>
-        <w:rPr>
-          <w:rFonts w:ascii="Book Antiqua" w:hAnsi="Book Antiqua"/>
-          <w:sz w:val="28"/>
-          <w:lang w:val="en-US"/>
-        </w:rPr>
-        <w:t>connecting well with customers, digital payments, customers don’t need to travel internationally to collect products</w:t>
-      </w:r>
-      <w:r>
-        <w:rPr>
-          <w:rFonts w:ascii="Book Antiqua" w:hAnsi="Book Antiqua"/>
-          <w:sz w:val="28"/>
-          <w:lang w:val="en-US"/>
-        </w:rPr>
-        <w:t>, making refunds case products are not received as expected by customers</w:t>
-      </w:r>
-      <w:r>
-        <w:rPr>
-          <w:rFonts w:ascii="Book Antiqua" w:hAnsi="Book Antiqua"/>
-          <w:sz w:val="28"/>
-          <w:lang w:val="en-US"/>
-        </w:rPr>
-        <w:t xml:space="preserve">, </w:t>
-      </w:r>
-      <w:r>
-        <w:rPr>
-          <w:rFonts w:ascii="Book Antiqua" w:hAnsi="Book Antiqua"/>
-          <w:sz w:val="28"/>
-          <w:lang w:val="en-US"/>
-        </w:rPr>
-        <w:t>but with that too, she’s been facing lots of challenges in her business regarding her customers and she would love our organization to help her encounter the problems for the betterment of her business activities.</w:t>
-      </w:r>
-      <w:r>
-        <w:rPr>
-          <w:rFonts w:ascii="Book Antiqua" w:hAnsi="Book Antiqua"/>
-          <w:sz w:val="28"/>
-          <w:lang w:val="en-US"/>
-        </w:rPr>
-        <w:t xml:space="preserve"> </w:t>
-      </w:r>
-    </w:p>
-    <w:p>
-      <w:pPr>
-        <w:pStyle w:val="Heading3"/>
-        <w:rPr>
-          <w:rFonts w:ascii="Book Antiqua" w:hAnsi="Book Antiqua"/>
-          <w:sz w:val="32"/>
-          <w:lang w:val="en-US"/>
-        </w:rPr>
-      </w:pPr>
-      <w:r>
-        <w:rPr>
-          <w:rFonts w:ascii="Book Antiqua" w:hAnsi="Book Antiqua"/>
-          <w:sz w:val="32"/>
-          <w:lang w:val="en-US"/>
-        </w:rPr>
-        <w:t>Business process challenges facing client’s business</w:t>
-      </w:r>
-    </w:p>
-    <w:p>
-      <w:pPr>
-        <w:pStyle w:val="ListParagraph"/>
-        <w:numPr>
-          <w:ilvl w:val="0"/>
-          <w:numId w:val="1"/>
-        </w:numPr>
-        <w:rPr>
-          <w:rFonts w:ascii="Book Antiqua" w:hAnsi="Book Antiqua"/>
-          <w:sz w:val="24"/>
-          <w:lang w:val="en-US"/>
-        </w:rPr>
-      </w:pPr>
-      <w:r>
-        <w:rPr>
-          <w:rFonts w:ascii="Book Antiqua" w:hAnsi="Book Antiqua"/>
-          <w:sz w:val="24"/>
-          <w:lang w:val="en-US"/>
-        </w:rPr>
-        <w:t>Long delivery times, unclear tracking, lost/delayed packages.</w:t>
-      </w:r>
-    </w:p>
-    <w:p>
-      <w:pPr>
-        <w:pStyle w:val="ListParagraph"/>
-        <w:numPr>
-          <w:ilvl w:val="0"/>
-          <w:numId w:val="1"/>
-        </w:numPr>
-        <w:rPr>
-          <w:rFonts w:ascii="Book Antiqua" w:hAnsi="Book Antiqua"/>
-          <w:sz w:val="24"/>
-          <w:lang w:val="en-US"/>
-        </w:rPr>
-      </w:pPr>
-      <w:r>
-        <w:rPr>
-          <w:rFonts w:ascii="Book Antiqua" w:hAnsi="Book Antiqua"/>
-          <w:sz w:val="24"/>
-          <w:lang w:val="en-US"/>
-        </w:rPr>
-        <w:t>Refund process may take time</w:t>
-      </w:r>
-    </w:p>
-    <w:p>
-      <w:pPr>
-        <w:pStyle w:val="ListParagraph"/>
-        <w:numPr>
-          <w:ilvl w:val="0"/>
-          <w:numId w:val="1"/>
-        </w:numPr>
-        <w:rPr>
-          <w:rFonts w:ascii="Book Antiqua" w:hAnsi="Book Antiqua"/>
-          <w:sz w:val="24"/>
-          <w:lang w:val="en-US"/>
-        </w:rPr>
-      </w:pPr>
-      <w:r>
-        <w:rPr>
-          <w:rFonts w:ascii="Book Antiqua" w:hAnsi="Book Antiqua"/>
-          <w:sz w:val="24"/>
-          <w:lang w:val="en-US"/>
-        </w:rPr>
-        <w:t xml:space="preserve">Fragmentation of the purchasing </w:t>
-      </w:r>
-      <w:r>
-        <w:rPr>
-          <w:rFonts w:ascii="Book Antiqua" w:hAnsi="Book Antiqua"/>
-          <w:sz w:val="24"/>
-          <w:lang w:val="en-US"/>
-        </w:rPr>
-        <w:t>process (</w:t>
-      </w:r>
-      <w:r>
-        <w:rPr>
-          <w:rFonts w:ascii="Book Antiqua" w:hAnsi="Book Antiqua"/>
-          <w:sz w:val="24"/>
-          <w:lang w:val="en-US"/>
-        </w:rPr>
-        <w:t>seller, courier and customs) may make it difficult for customer to know who should fix it incase anything goes wrong.</w:t>
-      </w:r>
-    </w:p>
-    <w:p>
-      <w:pPr>
-        <w:pStyle w:val="ListParagraph"/>
-        <w:numPr>
-          <w:ilvl w:val="0"/>
-          <w:numId w:val="1"/>
-        </w:numPr>
-        <w:rPr>
-          <w:rFonts w:ascii="Book Antiqua" w:hAnsi="Book Antiqua"/>
-          <w:sz w:val="24"/>
-          <w:lang w:val="en-US"/>
-        </w:rPr>
-      </w:pPr>
-      <w:r>
-        <w:rPr>
-          <w:rFonts w:ascii="Book Antiqua" w:hAnsi="Book Antiqua"/>
-          <w:sz w:val="24"/>
-          <w:lang w:val="en-US"/>
-        </w:rPr>
-        <w:t>Security concerns (hacking or products manipulation)</w:t>
-      </w:r>
-    </w:p>
-    <w:p>
-      <w:pPr>
-        <w:rPr>
-          <w:rFonts w:ascii="Book Antiqua" w:hAnsi="Book Antiqua"/>
-          <w:color w:val="FF0000"/>
-          <w:sz w:val="28"/>
-          <w:lang w:val="en-US"/>
-        </w:rPr>
-      </w:pPr>
-      <w:r>
-        <w:rPr>
-          <w:rFonts w:ascii="Book Antiqua" w:hAnsi="Book Antiqua"/>
-          <w:color w:val="FF0000"/>
-          <w:sz w:val="28"/>
-          <w:lang w:val="en-US"/>
-        </w:rPr>
-        <w:t>Suggested business solutions to the problems.</w:t>
-      </w:r>
-    </w:p>
-    <w:p>
-      <w:pPr>
-        <w:pStyle w:val="ListParagraph"/>
-        <w:numPr>
-          <w:ilvl w:val="0"/>
-          <w:numId w:val="4"/>
-        </w:numPr>
-        <w:rPr>
-          <w:rFonts w:ascii="Book Antiqua" w:hAnsi="Book Antiqua"/>
-          <w:sz w:val="28"/>
-          <w:lang w:val="en-US"/>
-        </w:rPr>
-      </w:pPr>
-      <w:r>
-        <w:rPr>
-          <w:rFonts w:ascii="Book Antiqua" w:hAnsi="Book Antiqua"/>
-          <w:sz w:val="28"/>
-          <w:lang w:val="en-US"/>
-        </w:rPr>
-        <w:t xml:space="preserve">Security concerns solution; adding 2-factor authentication for user accounts, </w:t>
-      </w:r>
-      <w:r>
-        <w:rPr>
-          <w:rFonts w:ascii="Book Antiqua" w:hAnsi="Book Antiqua"/>
-          <w:sz w:val="28"/>
-          <w:lang w:val="en-US"/>
-        </w:rPr>
-        <w:t>or data encryption of user accounts and transaction details so customer info stays completely safe from hackers.</w:t>
-      </w:r>
-    </w:p>
-    <w:p>
-      <w:pPr>
-        <w:pStyle w:val="ListParagraph"/>
-        <w:numPr>
-          <w:ilvl w:val="0"/>
-          <w:numId w:val="4"/>
-        </w:numPr>
-        <w:rPr>
-          <w:rFonts w:ascii="Book Antiqua" w:hAnsi="Book Antiqua"/>
-          <w:sz w:val="28"/>
-          <w:lang w:val="en-US"/>
-        </w:rPr>
-      </w:pPr>
-      <w:r>
-        <w:rPr>
-          <w:rFonts w:ascii="Book Antiqua" w:hAnsi="Book Antiqua"/>
-          <w:sz w:val="28"/>
-          <w:lang w:val="en-US"/>
-        </w:rPr>
-        <w:t>Purchasing process fragmentation solution; app should show who currently has the package so customer always knows who is handling it.</w:t>
-      </w:r>
-    </w:p>
-    <w:p>
-      <w:pPr>
-        <w:pStyle w:val="ListParagraph"/>
-        <w:numPr>
-          <w:ilvl w:val="0"/>
-          <w:numId w:val="4"/>
-        </w:numPr>
-        <w:rPr>
-          <w:rFonts w:ascii="Book Antiqua" w:hAnsi="Book Antiqua"/>
-          <w:sz w:val="28"/>
-          <w:lang w:val="en-US"/>
-        </w:rPr>
-      </w:pPr>
-      <w:r>
-        <w:rPr>
-          <w:rFonts w:ascii="Book Antiqua" w:hAnsi="Book Antiqua"/>
-          <w:sz w:val="28"/>
-          <w:lang w:val="en-US"/>
-        </w:rPr>
-        <w:t>Refund process speeding up; app should enable customers to request for refund or return by filling out a quick form and uploading a photo of any damaged item.</w:t>
-      </w:r>
-    </w:p>
-    <w:p>
-      <w:pPr>
-        <w:pStyle w:val="ListParagraph"/>
-        <w:numPr>
-          <w:ilvl w:val="0"/>
-          <w:numId w:val="4"/>
-        </w:numPr>
-        <w:rPr>
-          <w:rFonts w:ascii="Book Antiqua" w:hAnsi="Book Antiqua"/>
-          <w:sz w:val="28"/>
-          <w:lang w:val="en-US"/>
-        </w:rPr>
-      </w:pPr>
-      <w:r>
-        <w:rPr>
-          <w:rFonts w:ascii="Book Antiqua" w:hAnsi="Book Antiqua"/>
-          <w:sz w:val="28"/>
-          <w:lang w:val="en-US"/>
-        </w:rPr>
-        <w:t xml:space="preserve">Fixing long time </w:t>
-      </w:r>
       <w:proofErr w:type="gramStart"/>
       <w:r>
         <w:rPr>
@@ -375,7 +284,7 @@
           <w:sz w:val="28"/>
           <w:lang w:val="en-US"/>
         </w:rPr>
-        <w:t>deliveries ,</w:t>
+        <w:t>Lisa  receives</w:t>
       </w:r>
       <w:proofErr w:type="gramEnd"/>
       <w:r>
@@ -384,17 +293,72 @@
           <w:sz w:val="28"/>
           <w:lang w:val="en-US"/>
         </w:rPr>
-        <w:t xml:space="preserve"> unclear tracking and lost packages; app should be able to send automatic notifications or SMS messages whenever ordered package moves to a  new stage.</w:t>
-      </w:r>
-    </w:p>
-    <w:p>
-      <w:pPr>
-        <w:rPr>
-          <w:rFonts w:ascii="Book Antiqua" w:hAnsi="Book Antiqua"/>
-          <w:sz w:val="28"/>
-          <w:lang w:val="en-US"/>
-        </w:rPr>
-      </w:pPr>
+        <w:t xml:space="preserve"> order </w:t>
+      </w:r>
+      <w:r>
+        <w:rPr>
+          <w:rFonts w:ascii="Book Antiqua" w:hAnsi="Book Antiqua"/>
+          <w:sz w:val="28"/>
+          <w:lang w:val="en-US"/>
+        </w:rPr>
+        <w:sym w:font="Wingdings" w:char="F0E0"/>
+      </w:r>
+      <w:r>
+        <w:rPr>
+          <w:rFonts w:ascii="Book Antiqua" w:hAnsi="Book Antiqua"/>
+          <w:sz w:val="28"/>
+          <w:lang w:val="en-US"/>
+        </w:rPr>
+        <w:t xml:space="preserve"> Lisa confirms </w:t>
+      </w:r>
+      <w:r>
+        <w:rPr>
+          <w:rFonts w:ascii="Book Antiqua" w:hAnsi="Book Antiqua"/>
+          <w:sz w:val="28"/>
+          <w:lang w:val="en-US"/>
+        </w:rPr>
+        <w:sym w:font="Wingdings" w:char="F0E0"/>
+      </w:r>
+      <w:r>
+        <w:rPr>
+          <w:rFonts w:ascii="Book Antiqua" w:hAnsi="Book Antiqua"/>
+          <w:sz w:val="28"/>
+          <w:lang w:val="en-US"/>
+        </w:rPr>
+        <w:t xml:space="preserve"> Order is processed </w:t>
+      </w:r>
+      <w:r>
+        <w:rPr>
+          <w:rFonts w:ascii="Book Antiqua" w:hAnsi="Book Antiqua"/>
+          <w:sz w:val="28"/>
+          <w:lang w:val="en-US"/>
+        </w:rPr>
+        <w:sym w:font="Wingdings" w:char="F0E0"/>
+      </w:r>
+      <w:r>
+        <w:rPr>
+          <w:rFonts w:ascii="Book Antiqua" w:hAnsi="Book Antiqua"/>
+          <w:sz w:val="28"/>
+          <w:lang w:val="en-US"/>
+        </w:rPr>
+        <w:t xml:space="preserve"> Status updated </w:t>
+      </w:r>
+      <w:r>
+        <w:rPr>
+          <w:rFonts w:ascii="Book Antiqua" w:hAnsi="Book Antiqua"/>
+          <w:sz w:val="28"/>
+          <w:lang w:val="en-US"/>
+        </w:rPr>
+        <w:sym w:font="Wingdings" w:char="F0E0"/>
+      </w:r>
+      <w:r>
+        <w:rPr>
+          <w:rFonts w:ascii="Book Antiqua" w:hAnsi="Book Antiqua"/>
+          <w:sz w:val="28"/>
+          <w:lang w:val="en-US"/>
+        </w:rPr>
+        <w:t xml:space="preserve"> Seller sees status.</w:t>
+      </w:r>
     </w:p>
     <w:p>
       <w:pPr>
@@ -433,6 +397,32 @@
         </w:rPr>
         <w:lastRenderedPageBreak/>
         <w:t>Identified Variables</w:t>
+      </w:r>
+    </w:p>
+    <w:p>
+      <w:pPr>
+        <w:rPr>
+          <w:rFonts w:ascii="Book Antiqua" w:hAnsi="Book Antiqua"/>
+          <w:sz w:val="28"/>
+          <w:lang w:val="en-US"/>
+        </w:rPr>
+      </w:pPr>
+      <w:r>
+        <w:rPr>
+          <w:rFonts w:ascii="Book Antiqua" w:hAnsi="Book Antiqua"/>
+          <w:b/>
+          <w:sz w:val="28"/>
+          <w:lang w:val="en-US"/>
+        </w:rPr>
+        <w:t xml:space="preserve">Name of the app: </w:t>
+      </w:r>
+      <w:r>
+        <w:rPr>
+          <w:rFonts w:ascii="Book Antiqua" w:hAnsi="Book Antiqua"/>
+          <w:sz w:val="28"/>
+          <w:lang w:val="en-US"/>
+        </w:rPr>
+        <w:t>AgizaSafe –A Digital Order Management System for small-scale sellers.</w:t>
       </w:r>
     </w:p>
     <w:p>
@@ -478,15 +468,63 @@
           <w:sz w:val="28"/>
           <w:lang w:val="en-US"/>
         </w:rPr>
-        <w:t xml:space="preserve">Login; include email/username, user password, </w:t>
-      </w:r>
-      <w:r>
-        <w:rPr>
-          <w:rFonts w:ascii="Book Antiqua" w:hAnsi="Book Antiqua"/>
-          <w:sz w:val="28"/>
-          <w:lang w:val="en-US"/>
-        </w:rPr>
-        <w:t>create account if don’t have any, signing in with other means apart from username or email writing, user number entering with respective country code.</w:t>
+        <w:t>Login; include email/username</w:t>
+      </w:r>
+      <w:r>
+        <w:rPr>
+          <w:rFonts w:ascii="Book Antiqua" w:hAnsi="Book Antiqua"/>
+          <w:sz w:val="28"/>
+          <w:lang w:val="en-US"/>
+        </w:rPr>
+        <w:t xml:space="preserve"> or phone number,</w:t>
+      </w:r>
+      <w:r>
+        <w:rPr>
+          <w:rFonts w:ascii="Book Antiqua" w:hAnsi="Book Antiqua"/>
+          <w:sz w:val="28"/>
+          <w:lang w:val="en-US"/>
+        </w:rPr>
+        <w:t xml:space="preserve"> user password, </w:t>
+      </w:r>
+      <w:r>
+        <w:rPr>
+          <w:rFonts w:ascii="Book Antiqua" w:hAnsi="Book Antiqua"/>
+          <w:sz w:val="28"/>
+          <w:lang w:val="en-US"/>
+        </w:rPr>
+        <w:t>create account</w:t>
+      </w:r>
+      <w:r>
+        <w:rPr>
+          <w:rFonts w:ascii="Book Antiqua" w:hAnsi="Book Antiqua"/>
+          <w:sz w:val="28"/>
+          <w:lang w:val="en-US"/>
+        </w:rPr>
+        <w:t xml:space="preserve">, </w:t>
+      </w:r>
+      <w:r>
+        <w:rPr>
+          <w:rFonts w:ascii="Book Antiqua" w:hAnsi="Book Antiqua"/>
+          <w:sz w:val="28"/>
+          <w:lang w:val="en-US"/>
+        </w:rPr>
+        <w:t xml:space="preserve">user </w:t>
+      </w:r>
+      <w:r>
+        <w:rPr>
+          <w:rFonts w:ascii="Book Antiqua" w:hAnsi="Book Antiqua"/>
+          <w:sz w:val="28"/>
+          <w:lang w:val="en-US"/>
+        </w:rPr>
+        <w:t xml:space="preserve">phone </w:t>
+      </w:r>
+      <w:r>
+        <w:rPr>
+          <w:rFonts w:ascii="Book Antiqua" w:hAnsi="Book Antiqua"/>
+          <w:sz w:val="28"/>
+          <w:lang w:val="en-US"/>
+        </w:rPr>
+        <w:t>number entering with respective country code.</w:t>
       </w:r>
     </w:p>
     <w:p>
@@ -511,8 +549,6 @@
         </w:rPr>
         <w:t>Screen 2:</w:t>
       </w:r>
-      <w:bookmarkStart w:id="0" w:name="_GoBack"/>
-      <w:bookmarkEnd w:id="0"/>
     </w:p>
     <w:p>
       <w:pPr>
@@ -534,7 +570,15 @@
           <w:sz w:val="28"/>
           <w:lang w:val="en-US"/>
         </w:rPr>
-        <w:t>Two factor authentication or any other high security technology entered.</w:t>
+        <w:t>Two factor authentication</w:t>
+      </w:r>
+      <w:r>
+        <w:rPr>
+          <w:rFonts w:ascii="Book Antiqua" w:hAnsi="Book Antiqua"/>
+          <w:sz w:val="28"/>
+          <w:lang w:val="en-US"/>
+        </w:rPr>
+        <w:t>, OTP verification, password recovery.</w:t>
       </w:r>
     </w:p>
     <w:p>
@@ -580,7 +624,41 @@
           <w:sz w:val="28"/>
           <w:lang w:val="en-US"/>
         </w:rPr>
-        <w:t>Dashboard containing: Customer account details, tracking page, review and rating section, refunds section which should contain the filling form for refunds or returned and image section, payment means, business contacts. When a certain section clicked, should open a separate page.</w:t>
+        <w:t>Dashboard containing:</w:t>
+      </w:r>
+      <w:r>
+        <w:rPr>
+          <w:rFonts w:ascii="Book Antiqua" w:hAnsi="Book Antiqua"/>
+          <w:sz w:val="28"/>
+          <w:lang w:val="en-US"/>
+        </w:rPr>
+        <w:t xml:space="preserve"> My profile, </w:t>
+      </w:r>
+      <w:proofErr w:type="gramStart"/>
+      <w:r>
+        <w:rPr>
+          <w:rFonts w:ascii="Book Antiqua" w:hAnsi="Book Antiqua"/>
+          <w:sz w:val="28"/>
+          <w:lang w:val="en-US"/>
+        </w:rPr>
+        <w:t>Place</w:t>
+      </w:r>
+      <w:proofErr w:type="gramEnd"/>
+      <w:r>
+        <w:rPr>
+          <w:rFonts w:ascii="Book Antiqua" w:hAnsi="Book Antiqua"/>
+          <w:sz w:val="28"/>
+          <w:lang w:val="en-US"/>
+        </w:rPr>
+        <w:t xml:space="preserve"> an order, My orders, Track Order, Order history, Messages/Notifications, Review &amp; Ratings, Contact Lisa/Administrator</w:t>
+      </w:r>
+      <w:r>
+        <w:rPr>
+          <w:rFonts w:ascii="Book Antiqua" w:hAnsi="Book Antiqua"/>
+          <w:sz w:val="28"/>
+          <w:lang w:val="en-US"/>
+        </w:rPr>
+        <w:t>. When a certain section clicked, should open a separate page.</w:t>
       </w:r>
     </w:p>
     <w:p>
@@ -602,33 +680,250 @@
           <w:sz w:val="28"/>
           <w:lang w:val="en-US"/>
         </w:rPr>
-        <w:t xml:space="preserve">Automatic </w:t>
-      </w:r>
-      <w:r>
-        <w:rPr>
-          <w:rFonts w:ascii="Book Antiqua" w:hAnsi="Book Antiqua"/>
-          <w:sz w:val="28"/>
-          <w:lang w:val="en-US"/>
-        </w:rPr>
-        <w:t xml:space="preserve">pop </w:t>
-      </w:r>
-      <w:r>
-        <w:rPr>
-          <w:rFonts w:ascii="Book Antiqua" w:hAnsi="Book Antiqua"/>
-          <w:sz w:val="28"/>
-          <w:lang w:val="en-US"/>
-        </w:rPr>
-        <w:t>up messages to be sent to customers should be well structured.</w:t>
-      </w:r>
-    </w:p>
-    <w:p>
-      <w:pPr>
-        <w:rPr>
-          <w:rFonts w:ascii="Book Antiqua" w:hAnsi="Book Antiqua"/>
-          <w:sz w:val="28"/>
-          <w:lang w:val="en-US"/>
-        </w:rPr>
-      </w:pPr>
+        <w:t xml:space="preserve">Screen 4 </w:t>
+      </w:r>
+      <w:r>
+        <w:rPr>
+          <w:rFonts w:ascii="Book Antiqua" w:hAnsi="Book Antiqua"/>
+          <w:sz w:val="28"/>
+          <w:lang w:val="en-US"/>
+        </w:rPr>
+        <w:t>(</w:t>
+      </w:r>
+      <w:r>
+        <w:rPr>
+          <w:rFonts w:ascii="Book Antiqua" w:hAnsi="Book Antiqua"/>
+          <w:sz w:val="28"/>
+          <w:lang w:val="en-US"/>
+        </w:rPr>
+        <w:t>Place an order</w:t>
+      </w:r>
+      <w:r>
+        <w:rPr>
+          <w:rFonts w:ascii="Book Antiqua" w:hAnsi="Book Antiqua"/>
+          <w:sz w:val="28"/>
+          <w:lang w:val="en-US"/>
+        </w:rPr>
+        <w:t>)</w:t>
+      </w:r>
+      <w:r>
+        <w:rPr>
+          <w:rFonts w:ascii="Book Antiqua" w:hAnsi="Book Antiqua"/>
+          <w:sz w:val="28"/>
+          <w:lang w:val="en-US"/>
+        </w:rPr>
+        <w:t>: Seller should be able enter product name, product category, brand, quantity, size, color, product image, description. Then submit order. Lisa then receives order.</w:t>
+      </w:r>
+    </w:p>
+    <w:p>
+      <w:pPr>
+        <w:pStyle w:val="ListParagraph"/>
+        <w:numPr>
+          <w:ilvl w:val="0"/>
+          <w:numId w:val="5"/>
+        </w:numPr>
+        <w:rPr>
+          <w:rFonts w:ascii="Book Antiqua" w:hAnsi="Book Antiqua"/>
+          <w:sz w:val="28"/>
+          <w:lang w:val="en-US"/>
+        </w:rPr>
+      </w:pPr>
+      <w:r>
+        <w:rPr>
+          <w:rFonts w:ascii="Book Antiqua" w:hAnsi="Book Antiqua"/>
+          <w:sz w:val="28"/>
+          <w:lang w:val="en-US"/>
+        </w:rPr>
+        <w:t>Screen 5</w:t>
+      </w:r>
+      <w:r>
+        <w:rPr>
+          <w:rFonts w:ascii="Book Antiqua" w:hAnsi="Book Antiqua"/>
+          <w:sz w:val="28"/>
+          <w:lang w:val="en-US"/>
+        </w:rPr>
+        <w:t>(Order Details); Lisa should be able to see: Order e.g. Order #AG001 Seller name, Product, quantity, brand, color, size, date. And lastly Status.</w:t>
+      </w:r>
+    </w:p>
+    <w:p>
+      <w:pPr>
+        <w:pStyle w:val="ListParagraph"/>
+        <w:numPr>
+          <w:ilvl w:val="0"/>
+          <w:numId w:val="5"/>
+        </w:numPr>
+        <w:rPr>
+          <w:rFonts w:ascii="Book Antiqua" w:hAnsi="Book Antiqua"/>
+          <w:sz w:val="28"/>
+          <w:lang w:val="en-US"/>
+        </w:rPr>
+      </w:pPr>
+      <w:r>
+        <w:rPr>
+          <w:rFonts w:ascii="Book Antiqua" w:hAnsi="Book Antiqua"/>
+          <w:sz w:val="28"/>
+          <w:lang w:val="en-US"/>
+        </w:rPr>
+        <w:t>Screen 6(Order Tracking): example; “Order Placed”</w:t>
+      </w:r>
+      <w:r>
+        <w:rPr>
+          <w:rFonts w:ascii="Book Antiqua" w:hAnsi="Book Antiqua"/>
+          <w:sz w:val="28"/>
+          <w:lang w:val="en-US"/>
+        </w:rPr>
+        <w:sym w:font="Wingdings" w:char="F0E0"/>
+      </w:r>
+      <w:r>
+        <w:rPr>
+          <w:rFonts w:ascii="Book Antiqua" w:hAnsi="Book Antiqua"/>
+          <w:sz w:val="28"/>
+          <w:lang w:val="en-US"/>
+        </w:rPr>
+        <w:t xml:space="preserve"> “Order Confirmed” </w:t>
+      </w:r>
+      <w:r>
+        <w:rPr>
+          <w:rFonts w:ascii="Book Antiqua" w:hAnsi="Book Antiqua"/>
+          <w:sz w:val="28"/>
+          <w:lang w:val="en-US"/>
+        </w:rPr>
+        <w:sym w:font="Wingdings" w:char="F0E0"/>
+      </w:r>
+      <w:r>
+        <w:rPr>
+          <w:rFonts w:ascii="Book Antiqua" w:hAnsi="Book Antiqua"/>
+          <w:sz w:val="28"/>
+          <w:lang w:val="en-US"/>
+        </w:rPr>
+        <w:t xml:space="preserve"> “Product Sourced” </w:t>
+      </w:r>
+      <w:r>
+        <w:rPr>
+          <w:rFonts w:ascii="Book Antiqua" w:hAnsi="Book Antiqua"/>
+          <w:sz w:val="28"/>
+          <w:lang w:val="en-US"/>
+        </w:rPr>
+        <w:sym w:font="Wingdings" w:char="F0E0"/>
+      </w:r>
+      <w:r>
+        <w:rPr>
+          <w:rFonts w:ascii="Book Antiqua" w:hAnsi="Book Antiqua"/>
+          <w:sz w:val="28"/>
+          <w:lang w:val="en-US"/>
+        </w:rPr>
+        <w:t xml:space="preserve"> “Purchased” </w:t>
+      </w:r>
+      <w:r>
+        <w:rPr>
+          <w:rFonts w:ascii="Book Antiqua" w:hAnsi="Book Antiqua"/>
+          <w:sz w:val="28"/>
+          <w:lang w:val="en-US"/>
+        </w:rPr>
+        <w:sym w:font="Wingdings" w:char="F0E0"/>
+      </w:r>
+      <w:r>
+        <w:rPr>
+          <w:rFonts w:ascii="Book Antiqua" w:hAnsi="Book Antiqua"/>
+          <w:sz w:val="28"/>
+          <w:lang w:val="en-US"/>
+        </w:rPr>
+        <w:t xml:space="preserve"> “Shipped” </w:t>
+      </w:r>
+      <w:r>
+        <w:rPr>
+          <w:rFonts w:ascii="Book Antiqua" w:hAnsi="Book Antiqua"/>
+          <w:sz w:val="28"/>
+          <w:lang w:val="en-US"/>
+        </w:rPr>
+        <w:sym w:font="Wingdings" w:char="F0E0"/>
+      </w:r>
+      <w:r>
+        <w:rPr>
+          <w:rFonts w:ascii="Book Antiqua" w:hAnsi="Book Antiqua"/>
+          <w:sz w:val="28"/>
+          <w:lang w:val="en-US"/>
+        </w:rPr>
+        <w:t xml:space="preserve"> “Arrived” </w:t>
+      </w:r>
+      <w:r>
+        <w:rPr>
+          <w:rFonts w:ascii="Book Antiqua" w:hAnsi="Book Antiqua"/>
+          <w:sz w:val="28"/>
+          <w:lang w:val="en-US"/>
+        </w:rPr>
+        <w:sym w:font="Wingdings" w:char="F0E0"/>
+      </w:r>
+      <w:r>
+        <w:rPr>
+          <w:rFonts w:ascii="Book Antiqua" w:hAnsi="Book Antiqua"/>
+          <w:sz w:val="28"/>
+          <w:lang w:val="en-US"/>
+        </w:rPr>
+        <w:t xml:space="preserve"> “Delivered”. </w:t>
+      </w:r>
+      <w:r>
+        <w:rPr>
+          <w:rFonts w:ascii="Book Antiqua" w:hAnsi="Book Antiqua"/>
+          <w:sz w:val="28"/>
+          <w:lang w:val="en-US"/>
+        </w:rPr>
+        <w:t xml:space="preserve">This helps seller to see where their order where it is currently. </w:t>
+      </w:r>
+    </w:p>
+    <w:p>
+      <w:pPr>
+        <w:pStyle w:val="ListParagraph"/>
+        <w:numPr>
+          <w:ilvl w:val="0"/>
+          <w:numId w:val="5"/>
+        </w:numPr>
+        <w:rPr>
+          <w:rFonts w:ascii="Book Antiqua" w:hAnsi="Book Antiqua"/>
+          <w:sz w:val="28"/>
+          <w:lang w:val="en-US"/>
+        </w:rPr>
+      </w:pPr>
+      <w:r>
+        <w:rPr>
+          <w:rFonts w:ascii="Book Antiqua" w:hAnsi="Book Antiqua"/>
+          <w:sz w:val="28"/>
+          <w:lang w:val="en-US"/>
+        </w:rPr>
+        <w:t>Screen 7(Order History): This will help Lisa retrieve old records. App should show table containing order, product, Date, Quantity, Status. Lisa should also be able to search by seller, order ID, product, or date.</w:t>
+      </w:r>
+    </w:p>
+    <w:p>
+      <w:pPr>
+        <w:pStyle w:val="ListParagraph"/>
+        <w:numPr>
+          <w:ilvl w:val="0"/>
+          <w:numId w:val="5"/>
+        </w:numPr>
+        <w:rPr>
+          <w:rFonts w:ascii="Book Antiqua" w:hAnsi="Book Antiqua"/>
+          <w:sz w:val="28"/>
+          <w:lang w:val="en-US"/>
+        </w:rPr>
+      </w:pPr>
+      <w:r>
+        <w:rPr>
+          <w:rFonts w:ascii="Book Antiqua" w:hAnsi="Book Antiqua"/>
+          <w:sz w:val="28"/>
+          <w:lang w:val="en-US"/>
+        </w:rPr>
+        <w:t xml:space="preserve">Screen 8(Order </w:t>
+      </w:r>
+      <w:bookmarkStart w:id="0" w:name="_GoBack"/>
+      <w:bookmarkEnd w:id="0"/>
+      <w:r>
+        <w:rPr>
+          <w:rFonts w:ascii="Book Antiqua" w:hAnsi="Book Antiqua"/>
+          <w:sz w:val="28"/>
+          <w:lang w:val="en-US"/>
+        </w:rPr>
+        <w:t>Notifications) Example: “Your order AG001 has been confirmed”</w:t>
+      </w:r>
     </w:p>
     <w:sectPr>
       <w:pgSz w:w="11906" w:h="16838"/>
@@ -1070,7 +1365,7 @@
   <w:abstractNum w:abstractNumId="4" w15:restartNumberingAfterBreak="0">
     <w:nsid w:val="4B7923F4"/>
     <w:multiLevelType w:val="hybridMultilevel"/>
-    <w:tmpl w:val="21228268"/>
+    <w:tmpl w:val="FA8EA3DC"/>
     <w:lvl w:ilvl="0" w:tplc="20000001">
       <w:start w:val="1"/>
       <w:numFmt w:val="bullet"/>

</xml_diff>

<commit_message>
addition of how phases are going to proceed
</commit_message>
<xml_diff>
--- a/Requirements/clientWalkThrough.docx
+++ b/Requirements/clientWalkThrough.docx
@@ -48,32 +48,63 @@
           <w:rFonts w:ascii="Book Antiqua" w:hAnsi="Book Antiqua"/>
           <w:lang w:val="en-US"/>
         </w:rPr>
-        <w:t>LISA’S BUSINESS PROCESS NARRATION.</w:t>
-      </w:r>
-    </w:p>
-    <w:p>
-      <w:pPr>
-        <w:rPr>
-          <w:rFonts w:ascii="Book Antiqua" w:hAnsi="Book Antiqua"/>
-          <w:sz w:val="28"/>
-          <w:lang w:val="en-US"/>
-        </w:rPr>
-      </w:pPr>
-      <w:r>
-        <w:rPr>
-          <w:rFonts w:ascii="Book Antiqua" w:hAnsi="Book Antiqua"/>
-          <w:sz w:val="28"/>
-          <w:lang w:val="en-US"/>
-        </w:rPr>
-        <w:t xml:space="preserve">Lisa says that over the years, she’s been </w:t>
-      </w:r>
-      <w:r>
-        <w:rPr>
-          <w:rFonts w:ascii="Book Antiqua" w:hAnsi="Book Antiqua"/>
-          <w:sz w:val="28"/>
-          <w:lang w:val="en-US"/>
-        </w:rPr>
-        <w:t xml:space="preserve">operating a product-ordering business from China, where she helps small-scale sellers obtain products from different countries without requiring them to travel themselves. She manages a large group of sellers through WhatsApp, where sellers communicate their product requests and place orders. However, Lisa currently relies on handwritten records and WhatsApp conversations to manage sellers, products and orders. </w:t>
+        <w:t>CLIENT</w:t>
+      </w:r>
+      <w:r>
+        <w:rPr>
+          <w:rFonts w:ascii="Book Antiqua" w:hAnsi="Book Antiqua"/>
+          <w:lang w:val="en-US"/>
+        </w:rPr>
+        <w:t>’S BUSINESS PROCESS NARRATION.</w:t>
+      </w:r>
+    </w:p>
+    <w:p>
+      <w:pPr>
+        <w:rPr>
+          <w:rFonts w:ascii="Book Antiqua" w:hAnsi="Book Antiqua"/>
+          <w:sz w:val="28"/>
+          <w:lang w:val="en-US"/>
+        </w:rPr>
+      </w:pPr>
+      <w:r>
+        <w:rPr>
+          <w:rFonts w:ascii="Book Antiqua" w:hAnsi="Book Antiqua"/>
+          <w:sz w:val="28"/>
+          <w:lang w:val="en-US"/>
+        </w:rPr>
+        <w:t>Client</w:t>
+      </w:r>
+      <w:r>
+        <w:rPr>
+          <w:rFonts w:ascii="Book Antiqua" w:hAnsi="Book Antiqua"/>
+          <w:sz w:val="28"/>
+          <w:lang w:val="en-US"/>
+        </w:rPr>
+        <w:t xml:space="preserve"> says that over the years, she’s been </w:t>
+      </w:r>
+      <w:r>
+        <w:rPr>
+          <w:rFonts w:ascii="Book Antiqua" w:hAnsi="Book Antiqua"/>
+          <w:sz w:val="28"/>
+          <w:lang w:val="en-US"/>
+        </w:rPr>
+        <w:t>operating a product-ordering business from China, where she helps small-scale sellers obtain products from different countries without requiring them to travel themselves. She manages a large group of sellers through WhatsApp, where sellers communicate their product requests and place orders. However,</w:t>
+      </w:r>
+      <w:r>
+        <w:rPr>
+          <w:rFonts w:ascii="Book Antiqua" w:hAnsi="Book Antiqua"/>
+          <w:sz w:val="28"/>
+          <w:lang w:val="en-US"/>
+        </w:rPr>
+        <w:t xml:space="preserve"> Client</w:t>
+      </w:r>
+      <w:r>
+        <w:rPr>
+          <w:rFonts w:ascii="Book Antiqua" w:hAnsi="Book Antiqua"/>
+          <w:sz w:val="28"/>
+          <w:lang w:val="en-US"/>
+        </w:rPr>
+        <w:t xml:space="preserve"> currently relies on handwritten records and WhatsApp conversations to manage sellers, products and orders. </w:t>
       </w:r>
     </w:p>
     <w:p>
@@ -108,32 +139,48 @@
           <w:sz w:val="28"/>
           <w:lang w:val="en-US"/>
         </w:rPr>
-        <w:t>Lisa says that a</w:t>
-      </w:r>
-      <w:r>
-        <w:rPr>
-          <w:rFonts w:ascii="Book Antiqua" w:hAnsi="Book Antiqua"/>
-          <w:sz w:val="28"/>
-          <w:lang w:val="en-US"/>
-        </w:rPr>
-        <w:t>s the number of sellers, products and orders increases, it becomes difficult to accurately record, retrieve, organize and track orders and their history.</w:t>
-      </w:r>
-    </w:p>
-    <w:p>
-      <w:pPr>
-        <w:rPr>
-          <w:rFonts w:ascii="Book Antiqua" w:hAnsi="Book Antiqua"/>
-          <w:sz w:val="28"/>
-          <w:lang w:val="en-US"/>
-        </w:rPr>
-      </w:pPr>
-      <w:r>
-        <w:rPr>
-          <w:rFonts w:ascii="Book Antiqua" w:hAnsi="Book Antiqua"/>
-          <w:sz w:val="28"/>
-          <w:lang w:val="en-US"/>
-        </w:rPr>
-        <w:t>So, Lisa wants us to make her an app that will help her digitally manage and track orders placed by multiple sellers in an organized, reliable, and easily retrievable way.</w:t>
+        <w:t>Client</w:t>
+      </w:r>
+      <w:r>
+        <w:rPr>
+          <w:rFonts w:ascii="Book Antiqua" w:hAnsi="Book Antiqua"/>
+          <w:sz w:val="28"/>
+          <w:lang w:val="en-US"/>
+        </w:rPr>
+        <w:t xml:space="preserve"> says that as the number of sellers, products and orders increases, it becomes difficult to accurately record, retrieve, organize and track orders and their history.</w:t>
+      </w:r>
+    </w:p>
+    <w:p>
+      <w:pPr>
+        <w:rPr>
+          <w:rFonts w:ascii="Book Antiqua" w:hAnsi="Book Antiqua"/>
+          <w:sz w:val="28"/>
+          <w:lang w:val="en-US"/>
+        </w:rPr>
+      </w:pPr>
+      <w:r>
+        <w:rPr>
+          <w:rFonts w:ascii="Book Antiqua" w:hAnsi="Book Antiqua"/>
+          <w:sz w:val="28"/>
+          <w:lang w:val="en-US"/>
+        </w:rPr>
+        <w:t xml:space="preserve">So, </w:t>
+      </w:r>
+      <w:r>
+        <w:rPr>
+          <w:rFonts w:ascii="Book Antiqua" w:hAnsi="Book Antiqua"/>
+          <w:sz w:val="28"/>
+          <w:lang w:val="en-US"/>
+        </w:rPr>
+        <w:t>Client</w:t>
+      </w:r>
+      <w:r>
+        <w:rPr>
+          <w:rFonts w:ascii="Book Antiqua" w:hAnsi="Book Antiqua"/>
+          <w:sz w:val="28"/>
+          <w:lang w:val="en-US"/>
+        </w:rPr>
+        <w:t xml:space="preserve"> wants us to make her an app that will help her digitally manage and track orders placed by multiple sellers in an organized, reliable, and easily retrievable way.</w:t>
       </w:r>
     </w:p>
     <w:p>
@@ -176,7 +223,23 @@
           <w:sz w:val="28"/>
           <w:lang w:val="en-US"/>
         </w:rPr>
-        <w:t>The app should enable Lisa who is the administrator to: register sellers, record/receive orders, add product information, update order status, search order history and view seller records.</w:t>
+        <w:t xml:space="preserve">The app should enable </w:t>
+      </w:r>
+      <w:r>
+        <w:rPr>
+          <w:rFonts w:ascii="Book Antiqua" w:hAnsi="Book Antiqua"/>
+          <w:sz w:val="28"/>
+          <w:lang w:val="en-US"/>
+        </w:rPr>
+        <w:t>Client</w:t>
+      </w:r>
+      <w:r>
+        <w:rPr>
+          <w:rFonts w:ascii="Book Antiqua" w:hAnsi="Book Antiqua"/>
+          <w:sz w:val="28"/>
+          <w:lang w:val="en-US"/>
+        </w:rPr>
+        <w:t xml:space="preserve"> who is the administrator to: register sellers, record/receive orders, add product information, update order status, search order history and view seller records.</w:t>
       </w:r>
     </w:p>
     <w:p>
@@ -277,16 +340,22 @@
         </w:rPr>
         <w:t xml:space="preserve"> </w:t>
       </w:r>
-      <w:proofErr w:type="gramStart"/>
-      <w:r>
-        <w:rPr>
-          <w:rFonts w:ascii="Book Antiqua" w:hAnsi="Book Antiqua"/>
-          <w:sz w:val="28"/>
-          <w:lang w:val="en-US"/>
-        </w:rPr>
-        <w:t>Lisa  receives</w:t>
-      </w:r>
-      <w:proofErr w:type="gramEnd"/>
+      <w:r>
+        <w:rPr>
+          <w:rFonts w:ascii="Book Antiqua" w:hAnsi="Book Antiqua"/>
+          <w:sz w:val="28"/>
+          <w:lang w:val="en-US"/>
+        </w:rPr>
+        <w:t>Client</w:t>
+      </w:r>
+      <w:r>
+        <w:rPr>
+          <w:rFonts w:ascii="Book Antiqua" w:hAnsi="Book Antiqua"/>
+          <w:sz w:val="28"/>
+          <w:lang w:val="en-US"/>
+        </w:rPr>
+        <w:t xml:space="preserve"> receives</w:t>
+      </w:r>
       <w:r>
         <w:rPr>
           <w:rFonts w:ascii="Book Antiqua" w:hAnsi="Book Antiqua"/>
@@ -309,7 +378,23 @@
           <w:sz w:val="28"/>
           <w:lang w:val="en-US"/>
         </w:rPr>
-        <w:t xml:space="preserve"> Lisa confirms </w:t>
+        <w:t xml:space="preserve"> </w:t>
+      </w:r>
+      <w:r>
+        <w:rPr>
+          <w:rFonts w:ascii="Book Antiqua" w:hAnsi="Book Antiqua"/>
+          <w:sz w:val="28"/>
+          <w:lang w:val="en-US"/>
+        </w:rPr>
+        <w:t>Client</w:t>
+      </w:r>
+      <w:r>
+        <w:rPr>
+          <w:rFonts w:ascii="Book Antiqua" w:hAnsi="Book Antiqua"/>
+          <w:sz w:val="28"/>
+          <w:lang w:val="en-US"/>
+        </w:rPr>
+        <w:t xml:space="preserve"> confirms </w:t>
       </w:r>
       <w:r>
         <w:rPr>
@@ -632,25 +717,7 @@
           <w:sz w:val="28"/>
           <w:lang w:val="en-US"/>
         </w:rPr>
-        <w:t xml:space="preserve"> My profile, </w:t>
-      </w:r>
-      <w:proofErr w:type="gramStart"/>
-      <w:r>
-        <w:rPr>
-          <w:rFonts w:ascii="Book Antiqua" w:hAnsi="Book Antiqua"/>
-          <w:sz w:val="28"/>
-          <w:lang w:val="en-US"/>
-        </w:rPr>
-        <w:t>Place</w:t>
-      </w:r>
-      <w:proofErr w:type="gramEnd"/>
-      <w:r>
-        <w:rPr>
-          <w:rFonts w:ascii="Book Antiqua" w:hAnsi="Book Antiqua"/>
-          <w:sz w:val="28"/>
-          <w:lang w:val="en-US"/>
-        </w:rPr>
-        <w:t xml:space="preserve"> an order, My orders, Track Order, Order history, Messages/Notifications, Review &amp; Ratings, Contact Lisa/Administrator</w:t>
+        <w:t xml:space="preserve"> My profile, Place an order, My orders, Track Order, Order history, Messages/Notifications, Review &amp; Ratings, Contact Lisa/Administrator</w:t>
       </w:r>
       <w:r>
         <w:rPr>
@@ -890,7 +957,31 @@
           <w:sz w:val="28"/>
           <w:lang w:val="en-US"/>
         </w:rPr>
-        <w:t>Screen 7(Order History): This will help Lisa retrieve old records. App should show table containing order, product, Date, Quantity, Status. Lisa should also be able to search by seller, order ID, product, or date.</w:t>
+        <w:t>Screen 7(Order History): This will help</w:t>
+      </w:r>
+      <w:r>
+        <w:rPr>
+          <w:rFonts w:ascii="Book Antiqua" w:hAnsi="Book Antiqua"/>
+          <w:sz w:val="28"/>
+          <w:lang w:val="en-US"/>
+        </w:rPr>
+        <w:t xml:space="preserve"> </w:t>
+      </w:r>
+      <w:r>
+        <w:rPr>
+          <w:rFonts w:ascii="Book Antiqua" w:hAnsi="Book Antiqua"/>
+          <w:sz w:val="28"/>
+          <w:lang w:val="en-US"/>
+        </w:rPr>
+        <w:t xml:space="preserve">Client </w:t>
+      </w:r>
+      <w:r>
+        <w:rPr>
+          <w:rFonts w:ascii="Book Antiqua" w:hAnsi="Book Antiqua"/>
+          <w:sz w:val="28"/>
+          <w:lang w:val="en-US"/>
+        </w:rPr>
+        <w:t>retrieve old records. App should show table containing order, product, Date, Quantity, Status. Lisa should also be able to search by seller, order ID, product, or date.</w:t>
       </w:r>
     </w:p>
     <w:p>
@@ -912,7 +1003,600 @@
           <w:sz w:val="28"/>
           <w:lang w:val="en-US"/>
         </w:rPr>
-        <w:t xml:space="preserve">Screen 8(Order </w:t>
+        <w:t>Screen 8(Order Notifications) Example: “Your order AG001 has been confirmed”</w:t>
+      </w:r>
+    </w:p>
+    <w:p>
+      <w:pPr>
+        <w:rPr>
+          <w:rFonts w:ascii="Book Antiqua" w:hAnsi="Book Antiqua"/>
+          <w:sz w:val="28"/>
+          <w:lang w:val="en-US"/>
+        </w:rPr>
+      </w:pPr>
+    </w:p>
+    <w:p>
+      <w:pPr>
+        <w:rPr>
+          <w:rFonts w:ascii="Book Antiqua" w:hAnsi="Book Antiqua"/>
+          <w:sz w:val="28"/>
+          <w:lang w:val="en-US"/>
+        </w:rPr>
+      </w:pPr>
+      <w:r>
+        <w:rPr>
+          <w:rFonts w:ascii="Book Antiqua" w:hAnsi="Book Antiqua"/>
+          <w:sz w:val="28"/>
+          <w:lang w:val="en-US"/>
+        </w:rPr>
+        <w:t>The development of this system should be divided into four phases so that the system can be developed step by step since each phase will focus on a specific part of the business process.</w:t>
+      </w:r>
+    </w:p>
+    <w:p>
+      <w:pPr>
+        <w:rPr>
+          <w:rFonts w:ascii="Book Antiqua" w:hAnsi="Book Antiqua"/>
+          <w:sz w:val="28"/>
+          <w:lang w:val="en-US"/>
+        </w:rPr>
+      </w:pPr>
+      <w:r>
+        <w:rPr>
+          <w:rFonts w:ascii="Book Antiqua" w:hAnsi="Book Antiqua"/>
+          <w:sz w:val="28"/>
+          <w:lang w:val="en-US"/>
+        </w:rPr>
+        <w:t>This will make the system easier to develop, test, correct and improve before moving to the next phase. It also allows us to start with the most important functions and add advanced functions later.</w:t>
+      </w:r>
+    </w:p>
+    <w:p>
+      <w:pPr>
+        <w:rPr>
+          <w:rFonts w:ascii="Book Antiqua" w:hAnsi="Book Antiqua"/>
+          <w:sz w:val="28"/>
+          <w:lang w:val="en-US"/>
+        </w:rPr>
+      </w:pPr>
+      <w:r>
+        <w:rPr>
+          <w:rFonts w:ascii="Book Antiqua" w:hAnsi="Book Antiqua"/>
+          <w:sz w:val="28"/>
+          <w:lang w:val="en-US"/>
+        </w:rPr>
+        <w:lastRenderedPageBreak/>
+        <w:t>The following are the phases:</w:t>
+      </w:r>
+    </w:p>
+    <w:p>
+      <w:pPr>
+        <w:rPr>
+          <w:rFonts w:ascii="Book Antiqua" w:hAnsi="Book Antiqua"/>
+          <w:sz w:val="28"/>
+          <w:lang w:val="en-US"/>
+        </w:rPr>
+      </w:pPr>
+      <w:r>
+        <w:rPr>
+          <w:rFonts w:ascii="Book Antiqua" w:hAnsi="Book Antiqua"/>
+          <w:sz w:val="28"/>
+          <w:lang w:val="en-US"/>
+        </w:rPr>
+        <w:t>Phase 1:</w:t>
+      </w:r>
+      <w:r>
+        <w:rPr>
+          <w:rFonts w:ascii="Book Antiqua" w:hAnsi="Book Antiqua"/>
+          <w:sz w:val="28"/>
+          <w:lang w:val="en-US"/>
+        </w:rPr>
+        <w:t xml:space="preserve"> This establishes the database and basic business records.</w:t>
+      </w:r>
+    </w:p>
+    <w:p>
+      <w:pPr>
+        <w:pStyle w:val="ListParagraph"/>
+        <w:numPr>
+          <w:ilvl w:val="0"/>
+          <w:numId w:val="8"/>
+        </w:numPr>
+        <w:rPr>
+          <w:rFonts w:ascii="Book Antiqua" w:hAnsi="Book Antiqua"/>
+          <w:sz w:val="28"/>
+          <w:lang w:val="en-US"/>
+        </w:rPr>
+      </w:pPr>
+      <w:r>
+        <w:rPr>
+          <w:rFonts w:ascii="Book Antiqua" w:hAnsi="Book Antiqua"/>
+          <w:sz w:val="28"/>
+          <w:lang w:val="en-US"/>
+        </w:rPr>
+        <w:t>Client/Administration side development/Automation.</w:t>
+      </w:r>
+    </w:p>
+    <w:p>
+      <w:pPr>
+        <w:pStyle w:val="ListParagraph"/>
+        <w:numPr>
+          <w:ilvl w:val="1"/>
+          <w:numId w:val="8"/>
+        </w:numPr>
+        <w:rPr>
+          <w:rFonts w:ascii="Book Antiqua" w:hAnsi="Book Antiqua"/>
+          <w:sz w:val="28"/>
+          <w:lang w:val="en-US"/>
+        </w:rPr>
+      </w:pPr>
+      <w:r>
+        <w:rPr>
+          <w:rFonts w:ascii="Book Antiqua" w:hAnsi="Book Antiqua"/>
+          <w:sz w:val="28"/>
+          <w:lang w:val="en-US"/>
+        </w:rPr>
+        <w:t>Sellers Registration</w:t>
+      </w:r>
+    </w:p>
+    <w:p>
+      <w:pPr>
+        <w:pStyle w:val="ListParagraph"/>
+        <w:numPr>
+          <w:ilvl w:val="2"/>
+          <w:numId w:val="8"/>
+        </w:numPr>
+        <w:rPr>
+          <w:rFonts w:ascii="Book Antiqua" w:hAnsi="Book Antiqua"/>
+          <w:sz w:val="28"/>
+          <w:lang w:val="en-US"/>
+        </w:rPr>
+      </w:pPr>
+      <w:r>
+        <w:rPr>
+          <w:rFonts w:ascii="Book Antiqua" w:hAnsi="Book Antiqua"/>
+          <w:sz w:val="28"/>
+          <w:lang w:val="en-US"/>
+        </w:rPr>
+        <w:t>Names(three)</w:t>
+      </w:r>
+    </w:p>
+    <w:p>
+      <w:pPr>
+        <w:pStyle w:val="ListParagraph"/>
+        <w:numPr>
+          <w:ilvl w:val="2"/>
+          <w:numId w:val="8"/>
+        </w:numPr>
+        <w:rPr>
+          <w:rFonts w:ascii="Book Antiqua" w:hAnsi="Book Antiqua"/>
+          <w:sz w:val="28"/>
+          <w:lang w:val="en-US"/>
+        </w:rPr>
+      </w:pPr>
+      <w:r>
+        <w:rPr>
+          <w:rFonts w:ascii="Book Antiqua" w:hAnsi="Book Antiqua"/>
+          <w:sz w:val="28"/>
+          <w:lang w:val="en-US"/>
+        </w:rPr>
+        <w:t>Phone number</w:t>
+      </w:r>
+    </w:p>
+    <w:p>
+      <w:pPr>
+        <w:pStyle w:val="ListParagraph"/>
+        <w:numPr>
+          <w:ilvl w:val="2"/>
+          <w:numId w:val="8"/>
+        </w:numPr>
+        <w:rPr>
+          <w:rFonts w:ascii="Book Antiqua" w:hAnsi="Book Antiqua"/>
+          <w:sz w:val="28"/>
+          <w:lang w:val="en-US"/>
+        </w:rPr>
+      </w:pPr>
+      <w:r>
+        <w:rPr>
+          <w:rFonts w:ascii="Book Antiqua" w:hAnsi="Book Antiqua"/>
+          <w:sz w:val="28"/>
+          <w:lang w:val="en-US"/>
+        </w:rPr>
+        <w:t>Email(optional)</w:t>
+      </w:r>
+      <w:r>
+        <w:rPr>
+          <w:rFonts w:ascii="Book Antiqua" w:hAnsi="Book Antiqua"/>
+          <w:sz w:val="28"/>
+          <w:lang w:val="en-US"/>
+        </w:rPr>
+        <w:tab/>
+      </w:r>
+    </w:p>
+    <w:p>
+      <w:pPr>
+        <w:pStyle w:val="ListParagraph"/>
+        <w:numPr>
+          <w:ilvl w:val="2"/>
+          <w:numId w:val="8"/>
+        </w:numPr>
+        <w:rPr>
+          <w:rFonts w:ascii="Book Antiqua" w:hAnsi="Book Antiqua"/>
+          <w:sz w:val="28"/>
+          <w:lang w:val="en-US"/>
+        </w:rPr>
+      </w:pPr>
+      <w:r>
+        <w:rPr>
+          <w:rFonts w:ascii="Book Antiqua" w:hAnsi="Book Antiqua"/>
+          <w:sz w:val="28"/>
+          <w:lang w:val="en-US"/>
+        </w:rPr>
+        <w:t>Business sector</w:t>
+      </w:r>
+    </w:p>
+    <w:p>
+      <w:pPr>
+        <w:pStyle w:val="ListParagraph"/>
+        <w:numPr>
+          <w:ilvl w:val="2"/>
+          <w:numId w:val="8"/>
+        </w:numPr>
+        <w:rPr>
+          <w:rFonts w:ascii="Book Antiqua" w:hAnsi="Book Antiqua"/>
+          <w:sz w:val="28"/>
+          <w:lang w:val="en-US"/>
+        </w:rPr>
+      </w:pPr>
+      <w:r>
+        <w:rPr>
+          <w:rFonts w:ascii="Book Antiqua" w:hAnsi="Book Antiqua"/>
+          <w:sz w:val="28"/>
+          <w:lang w:val="en-US"/>
+        </w:rPr>
+        <w:t>Business Name</w:t>
+      </w:r>
+    </w:p>
+    <w:p>
+      <w:pPr>
+        <w:pStyle w:val="ListParagraph"/>
+        <w:numPr>
+          <w:ilvl w:val="2"/>
+          <w:numId w:val="8"/>
+        </w:numPr>
+        <w:rPr>
+          <w:rFonts w:ascii="Book Antiqua" w:hAnsi="Book Antiqua"/>
+          <w:sz w:val="28"/>
+          <w:lang w:val="en-US"/>
+        </w:rPr>
+      </w:pPr>
+      <w:r>
+        <w:rPr>
+          <w:rFonts w:ascii="Book Antiqua" w:hAnsi="Book Antiqua"/>
+          <w:sz w:val="28"/>
+          <w:lang w:val="en-US"/>
+        </w:rPr>
+        <w:t>Business Address</w:t>
+      </w:r>
+    </w:p>
+    <w:p>
+      <w:pPr>
+        <w:pStyle w:val="ListParagraph"/>
+        <w:numPr>
+          <w:ilvl w:val="1"/>
+          <w:numId w:val="8"/>
+        </w:numPr>
+        <w:rPr>
+          <w:rFonts w:ascii="Book Antiqua" w:hAnsi="Book Antiqua"/>
+          <w:sz w:val="28"/>
+          <w:lang w:val="en-US"/>
+        </w:rPr>
+      </w:pPr>
+      <w:r>
+        <w:rPr>
+          <w:rFonts w:ascii="Book Antiqua" w:hAnsi="Book Antiqua"/>
+          <w:sz w:val="28"/>
+          <w:lang w:val="en-US"/>
+        </w:rPr>
+        <w:t>View + Search Sellers</w:t>
+      </w:r>
+    </w:p>
+    <w:p>
+      <w:pPr>
+        <w:pStyle w:val="ListParagraph"/>
+        <w:numPr>
+          <w:ilvl w:val="0"/>
+          <w:numId w:val="8"/>
+        </w:numPr>
+        <w:rPr>
+          <w:rFonts w:ascii="Book Antiqua" w:hAnsi="Book Antiqua"/>
+          <w:sz w:val="28"/>
+          <w:lang w:val="en-US"/>
+        </w:rPr>
+      </w:pPr>
+    </w:p>
+    <w:p>
+      <w:pPr>
+        <w:pStyle w:val="ListParagraph"/>
+        <w:numPr>
+          <w:ilvl w:val="1"/>
+          <w:numId w:val="8"/>
+        </w:numPr>
+        <w:rPr>
+          <w:rFonts w:ascii="Book Antiqua" w:hAnsi="Book Antiqua"/>
+          <w:sz w:val="28"/>
+          <w:lang w:val="en-US"/>
+        </w:rPr>
+      </w:pPr>
+      <w:r>
+        <w:rPr>
+          <w:rFonts w:ascii="Book Antiqua" w:hAnsi="Book Antiqua"/>
+          <w:sz w:val="28"/>
+          <w:lang w:val="en-US"/>
+        </w:rPr>
+        <w:t>Sellers Order Registration</w:t>
+      </w:r>
+    </w:p>
+    <w:p>
+      <w:pPr>
+        <w:pStyle w:val="ListParagraph"/>
+        <w:numPr>
+          <w:ilvl w:val="2"/>
+          <w:numId w:val="8"/>
+        </w:numPr>
+        <w:rPr>
+          <w:rFonts w:ascii="Book Antiqua" w:hAnsi="Book Antiqua"/>
+          <w:sz w:val="28"/>
+          <w:lang w:val="en-US"/>
+        </w:rPr>
+      </w:pPr>
+      <w:r>
+        <w:rPr>
+          <w:rFonts w:ascii="Book Antiqua" w:hAnsi="Book Antiqua"/>
+          <w:sz w:val="28"/>
+          <w:lang w:val="en-US"/>
+        </w:rPr>
+        <w:t>Seller Id</w:t>
+      </w:r>
+    </w:p>
+    <w:p>
+      <w:pPr>
+        <w:pStyle w:val="ListParagraph"/>
+        <w:numPr>
+          <w:ilvl w:val="2"/>
+          <w:numId w:val="8"/>
+        </w:numPr>
+        <w:rPr>
+          <w:rFonts w:ascii="Book Antiqua" w:hAnsi="Book Antiqua"/>
+          <w:sz w:val="28"/>
+          <w:lang w:val="en-US"/>
+        </w:rPr>
+      </w:pPr>
+      <w:r>
+        <w:rPr>
+          <w:rFonts w:ascii="Book Antiqua" w:hAnsi="Book Antiqua"/>
+          <w:sz w:val="28"/>
+          <w:lang w:val="en-US"/>
+        </w:rPr>
+        <w:t>Item details</w:t>
+      </w:r>
+    </w:p>
+    <w:p>
+      <w:pPr>
+        <w:pStyle w:val="ListParagraph"/>
+        <w:numPr>
+          <w:ilvl w:val="2"/>
+          <w:numId w:val="8"/>
+        </w:numPr>
+        <w:rPr>
+          <w:rFonts w:ascii="Book Antiqua" w:hAnsi="Book Antiqua"/>
+          <w:sz w:val="28"/>
+          <w:lang w:val="en-US"/>
+        </w:rPr>
+      </w:pPr>
+      <w:r>
+        <w:rPr>
+          <w:rFonts w:ascii="Book Antiqua" w:hAnsi="Book Antiqua"/>
+          <w:sz w:val="28"/>
+          <w:lang w:val="en-US"/>
+        </w:rPr>
+        <w:t>Quantity</w:t>
+      </w:r>
+    </w:p>
+    <w:p>
+      <w:pPr>
+        <w:pStyle w:val="ListParagraph"/>
+        <w:numPr>
+          <w:ilvl w:val="2"/>
+          <w:numId w:val="8"/>
+        </w:numPr>
+        <w:rPr>
+          <w:rFonts w:ascii="Book Antiqua" w:hAnsi="Book Antiqua"/>
+          <w:sz w:val="28"/>
+          <w:lang w:val="en-US"/>
+        </w:rPr>
+      </w:pPr>
+      <w:r>
+        <w:rPr>
+          <w:rFonts w:ascii="Book Antiqua" w:hAnsi="Book Antiqua"/>
+          <w:sz w:val="28"/>
+          <w:lang w:val="en-US"/>
+        </w:rPr>
+        <w:t>Unit price</w:t>
+      </w:r>
+    </w:p>
+    <w:p>
+      <w:pPr>
+        <w:pStyle w:val="ListParagraph"/>
+        <w:numPr>
+          <w:ilvl w:val="2"/>
+          <w:numId w:val="8"/>
+        </w:numPr>
+        <w:rPr>
+          <w:rFonts w:ascii="Book Antiqua" w:hAnsi="Book Antiqua"/>
+          <w:sz w:val="28"/>
+          <w:lang w:val="en-US"/>
+        </w:rPr>
+      </w:pPr>
+      <w:r>
+        <w:rPr>
+          <w:rFonts w:ascii="Book Antiqua" w:hAnsi="Book Antiqua"/>
+          <w:sz w:val="28"/>
+          <w:lang w:val="en-US"/>
+        </w:rPr>
+        <w:t>Currency</w:t>
+      </w:r>
+    </w:p>
+    <w:p>
+      <w:pPr>
+        <w:pStyle w:val="ListParagraph"/>
+        <w:numPr>
+          <w:ilvl w:val="2"/>
+          <w:numId w:val="8"/>
+        </w:numPr>
+        <w:rPr>
+          <w:rFonts w:ascii="Book Antiqua" w:hAnsi="Book Antiqua"/>
+          <w:sz w:val="28"/>
+          <w:lang w:val="en-US"/>
+        </w:rPr>
+      </w:pPr>
+      <w:r>
+        <w:rPr>
+          <w:rFonts w:ascii="Book Antiqua" w:hAnsi="Book Antiqua"/>
+          <w:sz w:val="28"/>
+          <w:lang w:val="en-US"/>
+        </w:rPr>
+        <w:t>Order No</w:t>
+      </w:r>
+    </w:p>
+    <w:p>
+      <w:pPr>
+        <w:pStyle w:val="ListParagraph"/>
+        <w:numPr>
+          <w:ilvl w:val="2"/>
+          <w:numId w:val="8"/>
+        </w:numPr>
+        <w:rPr>
+          <w:rFonts w:ascii="Book Antiqua" w:hAnsi="Book Antiqua"/>
+          <w:sz w:val="28"/>
+          <w:lang w:val="en-US"/>
+        </w:rPr>
+      </w:pPr>
+      <w:r>
+        <w:rPr>
+          <w:rFonts w:ascii="Book Antiqua" w:hAnsi="Book Antiqua"/>
+          <w:sz w:val="28"/>
+          <w:lang w:val="en-US"/>
+        </w:rPr>
+        <w:t>Status</w:t>
+      </w:r>
+    </w:p>
+    <w:p>
+      <w:pPr>
+        <w:pStyle w:val="ListParagraph"/>
+        <w:numPr>
+          <w:ilvl w:val="1"/>
+          <w:numId w:val="8"/>
+        </w:numPr>
+        <w:rPr>
+          <w:rFonts w:ascii="Book Antiqua" w:hAnsi="Book Antiqua"/>
+          <w:sz w:val="28"/>
+          <w:lang w:val="en-US"/>
+        </w:rPr>
+      </w:pPr>
+      <w:r>
+        <w:rPr>
+          <w:rFonts w:ascii="Book Antiqua" w:hAnsi="Book Antiqua"/>
+          <w:sz w:val="28"/>
+          <w:lang w:val="en-US"/>
+        </w:rPr>
+        <w:t>View + Search orders</w:t>
+      </w:r>
+    </w:p>
+    <w:p>
+      <w:pPr>
+        <w:pStyle w:val="ListParagraph"/>
+        <w:numPr>
+          <w:ilvl w:val="0"/>
+          <w:numId w:val="8"/>
+        </w:numPr>
+        <w:rPr>
+          <w:rFonts w:ascii="Book Antiqua" w:hAnsi="Book Antiqua"/>
+          <w:sz w:val="28"/>
+          <w:lang w:val="en-US"/>
+        </w:rPr>
+      </w:pPr>
+      <w:r>
+        <w:rPr>
+          <w:rFonts w:ascii="Book Antiqua" w:hAnsi="Book Antiqua"/>
+          <w:sz w:val="28"/>
+          <w:lang w:val="en-US"/>
+        </w:rPr>
+        <w:t>Items Registration</w:t>
+      </w:r>
+    </w:p>
+    <w:p>
+      <w:pPr>
+        <w:rPr>
+          <w:rFonts w:ascii="Book Antiqua" w:hAnsi="Book Antiqua"/>
+          <w:sz w:val="28"/>
+          <w:lang w:val="en-US"/>
+        </w:rPr>
+      </w:pPr>
+      <w:r>
+        <w:rPr>
+          <w:rFonts w:ascii="Book Antiqua" w:hAnsi="Book Antiqua"/>
+          <w:sz w:val="28"/>
+          <w:lang w:val="en-US"/>
+        </w:rPr>
+        <w:t>Phase 2: Sellers Side development/Automation.</w:t>
+      </w:r>
+      <w:r>
+        <w:rPr>
+          <w:rFonts w:ascii="Book Antiqua" w:hAnsi="Book Antiqua"/>
+          <w:sz w:val="28"/>
+          <w:lang w:val="en-US"/>
+        </w:rPr>
+        <w:t xml:space="preserve"> (Makes sellers have controlled access to enter their own information and orders)</w:t>
+      </w:r>
+    </w:p>
+    <w:p>
+      <w:pPr>
+        <w:rPr>
+          <w:rFonts w:ascii="Book Antiqua" w:hAnsi="Book Antiqua"/>
+          <w:sz w:val="28"/>
+          <w:lang w:val="en-US"/>
+        </w:rPr>
+      </w:pPr>
+      <w:r>
+        <w:rPr>
+          <w:rFonts w:ascii="Book Antiqua" w:hAnsi="Book Antiqua"/>
+          <w:sz w:val="28"/>
+          <w:lang w:val="en-US"/>
+        </w:rPr>
+        <w:t>Phase 3: Order tracking.</w:t>
+      </w:r>
+      <w:r>
+        <w:rPr>
+          <w:rFonts w:ascii="Book Antiqua" w:hAnsi="Book Antiqua"/>
+          <w:sz w:val="28"/>
+          <w:lang w:val="en-US"/>
+        </w:rPr>
+        <w:t xml:space="preserve"> This makes system more useful allowing client and sellers to know what’s happening with an order.</w:t>
+      </w:r>
+    </w:p>
+    <w:p>
+      <w:pPr>
+        <w:rPr>
+          <w:rFonts w:ascii="Book Antiqua" w:hAnsi="Book Antiqua"/>
+          <w:sz w:val="28"/>
+          <w:lang w:val="en-US"/>
+        </w:rPr>
+      </w:pPr>
+      <w:r>
+        <w:rPr>
+          <w:rFonts w:ascii="Book Antiqua" w:hAnsi="Book Antiqua"/>
+          <w:sz w:val="28"/>
+          <w:lang w:val="en-US"/>
+        </w:rPr>
+        <w:t>Phase 4: Enhancements</w:t>
       </w:r>
       <w:bookmarkStart w:id="0" w:name="_GoBack"/>
       <w:bookmarkEnd w:id="0"/>
@@ -922,7 +1606,46 @@
           <w:sz w:val="28"/>
           <w:lang w:val="en-US"/>
         </w:rPr>
-        <w:t>Notifications) Example: “Your order AG001 has been confirmed”</w:t>
+        <w:t>; Include Image to items/products.</w:t>
+      </w:r>
+    </w:p>
+    <w:p>
+      <w:pPr>
+        <w:rPr>
+          <w:rFonts w:ascii="Book Antiqua" w:hAnsi="Book Antiqua"/>
+          <w:color w:val="000000" w:themeColor="text1"/>
+          <w:sz w:val="28"/>
+          <w:lang w:val="en-US"/>
+        </w:rPr>
+      </w:pPr>
+      <w:r>
+        <w:rPr>
+          <w:rFonts w:ascii="Book Antiqua" w:hAnsi="Book Antiqua"/>
+          <w:b/>
+          <w:i/>
+          <w:color w:val="FF0000"/>
+          <w:sz w:val="28"/>
+          <w:u w:val="single"/>
+          <w:lang w:val="en-US"/>
+        </w:rPr>
+        <w:t>Note:</w:t>
+      </w:r>
+      <w:r>
+        <w:rPr>
+          <w:rFonts w:ascii="Book Antiqua" w:hAnsi="Book Antiqua"/>
+          <w:color w:val="FF0000"/>
+          <w:sz w:val="28"/>
+          <w:lang w:val="en-US"/>
+        </w:rPr>
+        <w:t xml:space="preserve"> </w:t>
+      </w:r>
+      <w:r>
+        <w:rPr>
+          <w:rFonts w:ascii="Book Antiqua" w:hAnsi="Book Antiqua"/>
+          <w:sz w:val="28"/>
+          <w:lang w:val="en-US"/>
+        </w:rPr>
+        <w:t>Phase 2 and 4 can be used interchangeably.</w:t>
       </w:r>
     </w:p>
     <w:sectPr>
@@ -1051,6 +1774,92 @@
     </w:lvl>
   </w:abstractNum>
   <w:abstractNum w:abstractNumId="1" w15:restartNumberingAfterBreak="0">
+    <w:nsid w:val="1F86036F"/>
+    <w:multiLevelType w:val="hybridMultilevel"/>
+    <w:tmpl w:val="D9C635EC"/>
+    <w:lvl w:ilvl="0" w:tplc="20000017">
+      <w:start w:val="1"/>
+      <w:numFmt w:val="lowerLetter"/>
+      <w:lvlText w:val="%1)"/>
+      <w:lvlJc w:val="left"/>
+      <w:pPr>
+        <w:ind w:left="1440" w:hanging="360"/>
+      </w:pPr>
+    </w:lvl>
+    <w:lvl w:ilvl="1" w:tplc="20000019" w:tentative="1">
+      <w:start w:val="1"/>
+      <w:numFmt w:val="lowerLetter"/>
+      <w:lvlText w:val="%2."/>
+      <w:lvlJc w:val="left"/>
+      <w:pPr>
+        <w:ind w:left="2160" w:hanging="360"/>
+      </w:pPr>
+    </w:lvl>
+    <w:lvl w:ilvl="2" w:tplc="2000001B" w:tentative="1">
+      <w:start w:val="1"/>
+      <w:numFmt w:val="lowerRoman"/>
+      <w:lvlText w:val="%3."/>
+      <w:lvlJc w:val="right"/>
+      <w:pPr>
+        <w:ind w:left="2880" w:hanging="180"/>
+      </w:pPr>
+    </w:lvl>
+    <w:lvl w:ilvl="3" w:tplc="2000000F" w:tentative="1">
+      <w:start w:val="1"/>
+      <w:numFmt w:val="decimal"/>
+      <w:lvlText w:val="%4."/>
+      <w:lvlJc w:val="left"/>
+      <w:pPr>
+        <w:ind w:left="3600" w:hanging="360"/>
+      </w:pPr>
+    </w:lvl>
+    <w:lvl w:ilvl="4" w:tplc="20000019" w:tentative="1">
+      <w:start w:val="1"/>
+      <w:numFmt w:val="lowerLetter"/>
+      <w:lvlText w:val="%5."/>
+      <w:lvlJc w:val="left"/>
+      <w:pPr>
+        <w:ind w:left="4320" w:hanging="360"/>
+      </w:pPr>
+    </w:lvl>
+    <w:lvl w:ilvl="5" w:tplc="2000001B" w:tentative="1">
+      <w:start w:val="1"/>
+      <w:numFmt w:val="lowerRoman"/>
+      <w:lvlText w:val="%6."/>
+      <w:lvlJc w:val="right"/>
+      <w:pPr>
+        <w:ind w:left="5040" w:hanging="180"/>
+      </w:pPr>
+    </w:lvl>
+    <w:lvl w:ilvl="6" w:tplc="2000000F" w:tentative="1">
+      <w:start w:val="1"/>
+      <w:numFmt w:val="decimal"/>
+      <w:lvlText w:val="%7."/>
+      <w:lvlJc w:val="left"/>
+      <w:pPr>
+        <w:ind w:left="5760" w:hanging="360"/>
+      </w:pPr>
+    </w:lvl>
+    <w:lvl w:ilvl="7" w:tplc="20000019" w:tentative="1">
+      <w:start w:val="1"/>
+      <w:numFmt w:val="lowerLetter"/>
+      <w:lvlText w:val="%8."/>
+      <w:lvlJc w:val="left"/>
+      <w:pPr>
+        <w:ind w:left="6480" w:hanging="360"/>
+      </w:pPr>
+    </w:lvl>
+    <w:lvl w:ilvl="8" w:tplc="2000001B" w:tentative="1">
+      <w:start w:val="1"/>
+      <w:numFmt w:val="lowerRoman"/>
+      <w:lvlText w:val="%9."/>
+      <w:lvlJc w:val="right"/>
+      <w:pPr>
+        <w:ind w:left="7200" w:hanging="180"/>
+      </w:pPr>
+    </w:lvl>
+  </w:abstractNum>
+  <w:abstractNum w:abstractNumId="2" w15:restartNumberingAfterBreak="0">
     <w:nsid w:val="22A840E4"/>
     <w:multiLevelType w:val="hybridMultilevel"/>
     <w:tmpl w:val="346A4182"/>
@@ -1136,7 +1945,7 @@
       </w:pPr>
     </w:lvl>
   </w:abstractNum>
-  <w:abstractNum w:abstractNumId="2" w15:restartNumberingAfterBreak="0">
+  <w:abstractNum w:abstractNumId="3" w15:restartNumberingAfterBreak="0">
     <w:nsid w:val="39AC2CA0"/>
     <w:multiLevelType w:val="hybridMultilevel"/>
     <w:tmpl w:val="3D843A1A"/>
@@ -1249,7 +2058,7 @@
       </w:rPr>
     </w:lvl>
   </w:abstractNum>
-  <w:abstractNum w:abstractNumId="3" w15:restartNumberingAfterBreak="0">
+  <w:abstractNum w:abstractNumId="4" w15:restartNumberingAfterBreak="0">
     <w:nsid w:val="49BD13A8"/>
     <w:multiLevelType w:val="hybridMultilevel"/>
     <w:tmpl w:val="A33242C0"/>
@@ -1362,7 +2171,7 @@
       </w:rPr>
     </w:lvl>
   </w:abstractNum>
-  <w:abstractNum w:abstractNumId="4" w15:restartNumberingAfterBreak="0">
+  <w:abstractNum w:abstractNumId="5" w15:restartNumberingAfterBreak="0">
     <w:nsid w:val="4B7923F4"/>
     <w:multiLevelType w:val="hybridMultilevel"/>
     <w:tmpl w:val="FA8EA3DC"/>
@@ -1475,7 +2284,7 @@
       </w:rPr>
     </w:lvl>
   </w:abstractNum>
-  <w:abstractNum w:abstractNumId="5" w15:restartNumberingAfterBreak="0">
+  <w:abstractNum w:abstractNumId="6" w15:restartNumberingAfterBreak="0">
     <w:nsid w:val="4C632647"/>
     <w:multiLevelType w:val="hybridMultilevel"/>
     <w:tmpl w:val="3FE82970"/>
@@ -1561,7 +2370,7 @@
       </w:pPr>
     </w:lvl>
   </w:abstractNum>
-  <w:abstractNum w:abstractNumId="6" w15:restartNumberingAfterBreak="0">
+  <w:abstractNum w:abstractNumId="7" w15:restartNumberingAfterBreak="0">
     <w:nsid w:val="4FF6509E"/>
     <w:multiLevelType w:val="hybridMultilevel"/>
     <w:tmpl w:val="79BC7C8C"/>
@@ -1594,6 +2403,95 @@
       <w:pPr>
         <w:ind w:left="2160" w:hanging="180"/>
       </w:pPr>
+    </w:lvl>
+    <w:lvl w:ilvl="3" w:tplc="2000000F" w:tentative="1">
+      <w:start w:val="1"/>
+      <w:numFmt w:val="decimal"/>
+      <w:lvlText w:val="%4."/>
+      <w:lvlJc w:val="left"/>
+      <w:pPr>
+        <w:ind w:left="2880" w:hanging="360"/>
+      </w:pPr>
+    </w:lvl>
+    <w:lvl w:ilvl="4" w:tplc="20000019" w:tentative="1">
+      <w:start w:val="1"/>
+      <w:numFmt w:val="lowerLetter"/>
+      <w:lvlText w:val="%5."/>
+      <w:lvlJc w:val="left"/>
+      <w:pPr>
+        <w:ind w:left="3600" w:hanging="360"/>
+      </w:pPr>
+    </w:lvl>
+    <w:lvl w:ilvl="5" w:tplc="2000001B" w:tentative="1">
+      <w:start w:val="1"/>
+      <w:numFmt w:val="lowerRoman"/>
+      <w:lvlText w:val="%6."/>
+      <w:lvlJc w:val="right"/>
+      <w:pPr>
+        <w:ind w:left="4320" w:hanging="180"/>
+      </w:pPr>
+    </w:lvl>
+    <w:lvl w:ilvl="6" w:tplc="2000000F" w:tentative="1">
+      <w:start w:val="1"/>
+      <w:numFmt w:val="decimal"/>
+      <w:lvlText w:val="%7."/>
+      <w:lvlJc w:val="left"/>
+      <w:pPr>
+        <w:ind w:left="5040" w:hanging="360"/>
+      </w:pPr>
+    </w:lvl>
+    <w:lvl w:ilvl="7" w:tplc="20000019" w:tentative="1">
+      <w:start w:val="1"/>
+      <w:numFmt w:val="lowerLetter"/>
+      <w:lvlText w:val="%8."/>
+      <w:lvlJc w:val="left"/>
+      <w:pPr>
+        <w:ind w:left="5760" w:hanging="360"/>
+      </w:pPr>
+    </w:lvl>
+    <w:lvl w:ilvl="8" w:tplc="2000001B" w:tentative="1">
+      <w:start w:val="1"/>
+      <w:numFmt w:val="lowerRoman"/>
+      <w:lvlText w:val="%9."/>
+      <w:lvlJc w:val="right"/>
+      <w:pPr>
+        <w:ind w:left="6480" w:hanging="180"/>
+      </w:pPr>
+    </w:lvl>
+  </w:abstractNum>
+  <w:abstractNum w:abstractNumId="8" w15:restartNumberingAfterBreak="0">
+    <w:nsid w:val="6F8B7A08"/>
+    <w:multiLevelType w:val="hybridMultilevel"/>
+    <w:tmpl w:val="6CA0ACEA"/>
+    <w:lvl w:ilvl="0" w:tplc="2000000F">
+      <w:start w:val="1"/>
+      <w:numFmt w:val="decimal"/>
+      <w:lvlText w:val="%1."/>
+      <w:lvlJc w:val="left"/>
+      <w:pPr>
+        <w:ind w:left="720" w:hanging="360"/>
+      </w:pPr>
+    </w:lvl>
+    <w:lvl w:ilvl="1" w:tplc="20000017">
+      <w:start w:val="1"/>
+      <w:numFmt w:val="lowerLetter"/>
+      <w:lvlText w:val="%2)"/>
+      <w:lvlJc w:val="left"/>
+      <w:pPr>
+        <w:ind w:left="1440" w:hanging="360"/>
+      </w:pPr>
+    </w:lvl>
+    <w:lvl w:ilvl="2" w:tplc="20000001">
+      <w:start w:val="1"/>
+      <w:numFmt w:val="bullet"/>
+      <w:lvlText w:val=""/>
+      <w:lvlJc w:val="left"/>
+      <w:pPr>
+        <w:ind w:left="2160" w:hanging="180"/>
+      </w:pPr>
+      <w:rPr>
+        <w:rFonts w:ascii="Symbol" w:hAnsi="Symbol" w:hint="default"/>
+      </w:rPr>
     </w:lvl>
     <w:lvl w:ilvl="3" w:tplc="2000000F" w:tentative="1">
       <w:start w:val="1"/>
@@ -1654,21 +2552,27 @@
     <w:abstractNumId w:val="0"/>
   </w:num>
   <w:num w:numId="2">
+    <w:abstractNumId w:val="3"/>
+  </w:num>
+  <w:num w:numId="3">
+    <w:abstractNumId w:val="4"/>
+  </w:num>
+  <w:num w:numId="4">
+    <w:abstractNumId w:val="6"/>
+  </w:num>
+  <w:num w:numId="5">
+    <w:abstractNumId w:val="7"/>
+  </w:num>
+  <w:num w:numId="6">
+    <w:abstractNumId w:val="5"/>
+  </w:num>
+  <w:num w:numId="7">
     <w:abstractNumId w:val="2"/>
   </w:num>
-  <w:num w:numId="3">
-    <w:abstractNumId w:val="3"/>
+  <w:num w:numId="8">
+    <w:abstractNumId w:val="8"/>
   </w:num>
-  <w:num w:numId="4">
-    <w:abstractNumId w:val="5"/>
-  </w:num>
-  <w:num w:numId="5">
-    <w:abstractNumId w:val="6"/>
-  </w:num>
-  <w:num w:numId="6">
-    <w:abstractNumId w:val="4"/>
-  </w:num>
-  <w:num w:numId="7">
+  <w:num w:numId="9">
     <w:abstractNumId w:val="1"/>
   </w:num>
 </w:numbering>

</xml_diff>

<commit_message>
better modification of the work
</commit_message>
<xml_diff>
--- a/Requirements/clientWalkThrough.docx
+++ b/Requirements/clientWalkThrough.docx
@@ -7,16 +7,819 @@
         <w:pStyle w:val="Heading1"/>
         <w:rPr>
           <w:rFonts w:ascii="Book Antiqua" w:hAnsi="Book Antiqua"/>
-          <w:lang w:val="en-US"/>
-        </w:rPr>
-      </w:pPr>
-      <w:r>
-        <w:rPr>
-          <w:rFonts w:ascii="Book Antiqua" w:hAnsi="Book Antiqua"/>
-          <w:lang w:val="en-US"/>
-        </w:rPr>
+        </w:rPr>
+      </w:pPr>
+    </w:p>
+    <w:sdt>
+      <w:sdtPr>
+        <w:rPr>
+          <w:rFonts w:asciiTheme="minorHAnsi" w:eastAsiaTheme="minorHAnsi" w:hAnsiTheme="minorHAnsi" w:cstheme="minorBidi"/>
+          <w:color w:val="auto"/>
+          <w:sz w:val="22"/>
+          <w:szCs w:val="22"/>
+          <w:lang w:val="en-TZ"/>
+        </w:rPr>
+        <w:id w:val="571003767"/>
+        <w:docPartObj>
+          <w:docPartGallery w:val="Table of Contents"/>
+          <w:docPartUnique/>
+        </w:docPartObj>
+      </w:sdtPr>
+      <w:sdtEndPr>
+        <w:rPr>
+          <w:b/>
+          <w:bCs/>
+          <w:noProof/>
+        </w:rPr>
+      </w:sdtEndPr>
+      <w:sdtContent>
+        <w:p>
+          <w:pPr>
+            <w:pStyle w:val="TOCHeading"/>
+          </w:pPr>
+          <w:r>
+            <w:t>Table of Contents</w:t>
+          </w:r>
+        </w:p>
+        <w:p>
+          <w:pPr>
+            <w:pStyle w:val="TOC1"/>
+            <w:tabs>
+              <w:tab w:val="right" w:leader="dot" w:pos="9605"/>
+            </w:tabs>
+            <w:rPr>
+              <w:rFonts w:eastAsiaTheme="minorEastAsia"/>
+              <w:noProof/>
+              <w:lang w:eastAsia="en-TZ"/>
+            </w:rPr>
+          </w:pPr>
+          <w:r>
+            <w:rPr>
+              <w:b/>
+              <w:bCs/>
+              <w:noProof/>
+            </w:rPr>
+            <w:fldChar w:fldCharType="begin"/>
+          </w:r>
+          <w:r>
+            <w:rPr>
+              <w:b/>
+              <w:bCs/>
+              <w:noProof/>
+            </w:rPr>
+            <w:instrText xml:space="preserve"> TOC \o "1-3" \h \z \u </w:instrText>
+          </w:r>
+          <w:r>
+            <w:rPr>
+              <w:b/>
+              <w:bCs/>
+              <w:noProof/>
+            </w:rPr>
+            <w:fldChar w:fldCharType="separate"/>
+          </w:r>
+          <w:hyperlink w:anchor="_Toc237592540" w:history="1">
+            <w:r>
+              <w:rPr>
+                <w:rStyle w:val="Hyperlink"/>
+                <w:rFonts w:ascii="Book Antiqua" w:hAnsi="Book Antiqua"/>
+                <w:noProof/>
+              </w:rPr>
+              <w:t>CLIENT DETAILS</w:t>
+            </w:r>
+            <w:r>
+              <w:rPr>
+                <w:noProof/>
+                <w:webHidden/>
+              </w:rPr>
+              <w:tab/>
+            </w:r>
+            <w:r>
+              <w:rPr>
+                <w:noProof/>
+                <w:webHidden/>
+              </w:rPr>
+              <w:fldChar w:fldCharType="begin"/>
+            </w:r>
+            <w:r>
+              <w:rPr>
+                <w:noProof/>
+                <w:webHidden/>
+              </w:rPr>
+              <w:instrText xml:space="preserve"> PAGEREF _Toc237592540 \h </w:instrText>
+            </w:r>
+            <w:r>
+              <w:rPr>
+                <w:noProof/>
+                <w:webHidden/>
+              </w:rPr>
+            </w:r>
+            <w:r>
+              <w:rPr>
+                <w:noProof/>
+                <w:webHidden/>
+              </w:rPr>
+              <w:fldChar w:fldCharType="separate"/>
+            </w:r>
+            <w:r>
+              <w:rPr>
+                <w:noProof/>
+                <w:webHidden/>
+              </w:rPr>
+              <w:t>3</w:t>
+            </w:r>
+            <w:r>
+              <w:rPr>
+                <w:noProof/>
+                <w:webHidden/>
+              </w:rPr>
+              <w:fldChar w:fldCharType="end"/>
+            </w:r>
+          </w:hyperlink>
+        </w:p>
+        <w:p>
+          <w:pPr>
+            <w:pStyle w:val="TOC1"/>
+            <w:tabs>
+              <w:tab w:val="right" w:leader="dot" w:pos="9605"/>
+            </w:tabs>
+            <w:rPr>
+              <w:rFonts w:eastAsiaTheme="minorEastAsia"/>
+              <w:noProof/>
+              <w:lang w:eastAsia="en-TZ"/>
+            </w:rPr>
+          </w:pPr>
+          <w:hyperlink w:anchor="_Toc237592541" w:history="1">
+            <w:r>
+              <w:rPr>
+                <w:rStyle w:val="Hyperlink"/>
+                <w:rFonts w:ascii="Book Antiqua" w:hAnsi="Book Antiqua"/>
+                <w:noProof/>
+                <w:lang w:val="en-US"/>
+              </w:rPr>
+              <w:t>CLIENT’S BUSINESS PROCESS NARRATION.</w:t>
+            </w:r>
+            <w:r>
+              <w:rPr>
+                <w:noProof/>
+                <w:webHidden/>
+              </w:rPr>
+              <w:tab/>
+            </w:r>
+            <w:r>
+              <w:rPr>
+                <w:noProof/>
+                <w:webHidden/>
+              </w:rPr>
+              <w:fldChar w:fldCharType="begin"/>
+            </w:r>
+            <w:r>
+              <w:rPr>
+                <w:noProof/>
+                <w:webHidden/>
+              </w:rPr>
+              <w:instrText xml:space="preserve"> PAGEREF _Toc237592541 \h </w:instrText>
+            </w:r>
+            <w:r>
+              <w:rPr>
+                <w:noProof/>
+                <w:webHidden/>
+              </w:rPr>
+            </w:r>
+            <w:r>
+              <w:rPr>
+                <w:noProof/>
+                <w:webHidden/>
+              </w:rPr>
+              <w:fldChar w:fldCharType="separate"/>
+            </w:r>
+            <w:r>
+              <w:rPr>
+                <w:noProof/>
+                <w:webHidden/>
+              </w:rPr>
+              <w:t>3</w:t>
+            </w:r>
+            <w:r>
+              <w:rPr>
+                <w:noProof/>
+                <w:webHidden/>
+              </w:rPr>
+              <w:fldChar w:fldCharType="end"/>
+            </w:r>
+          </w:hyperlink>
+        </w:p>
+        <w:p>
+          <w:pPr>
+            <w:pStyle w:val="TOC1"/>
+            <w:tabs>
+              <w:tab w:val="right" w:leader="dot" w:pos="9605"/>
+            </w:tabs>
+            <w:rPr>
+              <w:rFonts w:eastAsiaTheme="minorEastAsia"/>
+              <w:noProof/>
+              <w:lang w:eastAsia="en-TZ"/>
+            </w:rPr>
+          </w:pPr>
+          <w:hyperlink w:anchor="_Toc237592542" w:history="1">
+            <w:r>
+              <w:rPr>
+                <w:rStyle w:val="Hyperlink"/>
+                <w:rFonts w:ascii="Book Antiqua" w:hAnsi="Book Antiqua"/>
+                <w:noProof/>
+                <w:lang w:val="en-US"/>
+              </w:rPr>
+              <w:t>BUSINESS PROCESS CHALLENGES CLIENT FACES.</w:t>
+            </w:r>
+            <w:r>
+              <w:rPr>
+                <w:noProof/>
+                <w:webHidden/>
+              </w:rPr>
+              <w:tab/>
+            </w:r>
+            <w:r>
+              <w:rPr>
+                <w:noProof/>
+                <w:webHidden/>
+              </w:rPr>
+              <w:fldChar w:fldCharType="begin"/>
+            </w:r>
+            <w:r>
+              <w:rPr>
+                <w:noProof/>
+                <w:webHidden/>
+              </w:rPr>
+              <w:instrText xml:space="preserve"> PAGEREF _Toc237592542 \h </w:instrText>
+            </w:r>
+            <w:r>
+              <w:rPr>
+                <w:noProof/>
+                <w:webHidden/>
+              </w:rPr>
+            </w:r>
+            <w:r>
+              <w:rPr>
+                <w:noProof/>
+                <w:webHidden/>
+              </w:rPr>
+              <w:fldChar w:fldCharType="separate"/>
+            </w:r>
+            <w:r>
+              <w:rPr>
+                <w:noProof/>
+                <w:webHidden/>
+              </w:rPr>
+              <w:t>3</w:t>
+            </w:r>
+            <w:r>
+              <w:rPr>
+                <w:noProof/>
+                <w:webHidden/>
+              </w:rPr>
+              <w:fldChar w:fldCharType="end"/>
+            </w:r>
+          </w:hyperlink>
+        </w:p>
+        <w:p>
+          <w:pPr>
+            <w:pStyle w:val="TOC1"/>
+            <w:tabs>
+              <w:tab w:val="right" w:leader="dot" w:pos="9605"/>
+            </w:tabs>
+            <w:rPr>
+              <w:rFonts w:eastAsiaTheme="minorEastAsia"/>
+              <w:noProof/>
+              <w:lang w:eastAsia="en-TZ"/>
+            </w:rPr>
+          </w:pPr>
+          <w:hyperlink w:anchor="_Toc237592543" w:history="1">
+            <w:r>
+              <w:rPr>
+                <w:rStyle w:val="Hyperlink"/>
+                <w:rFonts w:ascii="Book Antiqua" w:hAnsi="Book Antiqua"/>
+                <w:noProof/>
+                <w:lang w:val="en-US"/>
+              </w:rPr>
+              <w:t>SUGGESTED SOLUTIONS TO THE CLIENT’S CUSTOMERS.</w:t>
+            </w:r>
+            <w:r>
+              <w:rPr>
+                <w:noProof/>
+                <w:webHidden/>
+              </w:rPr>
+              <w:tab/>
+            </w:r>
+            <w:r>
+              <w:rPr>
+                <w:noProof/>
+                <w:webHidden/>
+              </w:rPr>
+              <w:fldChar w:fldCharType="begin"/>
+            </w:r>
+            <w:r>
+              <w:rPr>
+                <w:noProof/>
+                <w:webHidden/>
+              </w:rPr>
+              <w:instrText xml:space="preserve"> PAGEREF _Toc237592543 \h </w:instrText>
+            </w:r>
+            <w:r>
+              <w:rPr>
+                <w:noProof/>
+                <w:webHidden/>
+              </w:rPr>
+            </w:r>
+            <w:r>
+              <w:rPr>
+                <w:noProof/>
+                <w:webHidden/>
+              </w:rPr>
+              <w:fldChar w:fldCharType="separate"/>
+            </w:r>
+            <w:r>
+              <w:rPr>
+                <w:noProof/>
+                <w:webHidden/>
+              </w:rPr>
+              <w:t>3</w:t>
+            </w:r>
+            <w:r>
+              <w:rPr>
+                <w:noProof/>
+                <w:webHidden/>
+              </w:rPr>
+              <w:fldChar w:fldCharType="end"/>
+            </w:r>
+          </w:hyperlink>
+        </w:p>
+        <w:p>
+          <w:pPr>
+            <w:pStyle w:val="TOC1"/>
+            <w:tabs>
+              <w:tab w:val="right" w:leader="dot" w:pos="9605"/>
+            </w:tabs>
+            <w:rPr>
+              <w:rFonts w:eastAsiaTheme="minorEastAsia"/>
+              <w:noProof/>
+              <w:lang w:eastAsia="en-TZ"/>
+            </w:rPr>
+          </w:pPr>
+          <w:hyperlink w:anchor="_Toc237592544" w:history="1">
+            <w:r>
+              <w:rPr>
+                <w:rStyle w:val="Hyperlink"/>
+                <w:rFonts w:ascii="Book Antiqua" w:hAnsi="Book Antiqua"/>
+                <w:noProof/>
+                <w:lang w:val="en-US"/>
+              </w:rPr>
+              <w:t>THE APPLICATION’S ROADMAP</w:t>
+            </w:r>
+            <w:r>
+              <w:rPr>
+                <w:noProof/>
+                <w:webHidden/>
+              </w:rPr>
+              <w:tab/>
+            </w:r>
+            <w:r>
+              <w:rPr>
+                <w:noProof/>
+                <w:webHidden/>
+              </w:rPr>
+              <w:fldChar w:fldCharType="begin"/>
+            </w:r>
+            <w:r>
+              <w:rPr>
+                <w:noProof/>
+                <w:webHidden/>
+              </w:rPr>
+              <w:instrText xml:space="preserve"> PAGEREF _Toc237592544 \h </w:instrText>
+            </w:r>
+            <w:r>
+              <w:rPr>
+                <w:noProof/>
+                <w:webHidden/>
+              </w:rPr>
+            </w:r>
+            <w:r>
+              <w:rPr>
+                <w:noProof/>
+                <w:webHidden/>
+              </w:rPr>
+              <w:fldChar w:fldCharType="separate"/>
+            </w:r>
+            <w:r>
+              <w:rPr>
+                <w:noProof/>
+                <w:webHidden/>
+              </w:rPr>
+              <w:t>5</w:t>
+            </w:r>
+            <w:r>
+              <w:rPr>
+                <w:noProof/>
+                <w:webHidden/>
+              </w:rPr>
+              <w:fldChar w:fldCharType="end"/>
+            </w:r>
+          </w:hyperlink>
+        </w:p>
+        <w:p>
+          <w:pPr>
+            <w:pStyle w:val="TOC2"/>
+            <w:tabs>
+              <w:tab w:val="right" w:leader="dot" w:pos="9605"/>
+            </w:tabs>
+            <w:rPr>
+              <w:rFonts w:eastAsiaTheme="minorEastAsia"/>
+              <w:noProof/>
+              <w:lang w:eastAsia="en-TZ"/>
+            </w:rPr>
+          </w:pPr>
+          <w:hyperlink w:anchor="_Toc237592545" w:history="1">
+            <w:r>
+              <w:rPr>
+                <w:rStyle w:val="Hyperlink"/>
+                <w:rFonts w:ascii="Book Antiqua" w:hAnsi="Book Antiqua"/>
+                <w:noProof/>
+              </w:rPr>
+              <w:t>Phase 1:</w:t>
+            </w:r>
+            <w:r>
+              <w:rPr>
+                <w:noProof/>
+                <w:webHidden/>
+              </w:rPr>
+              <w:tab/>
+            </w:r>
+            <w:r>
+              <w:rPr>
+                <w:noProof/>
+                <w:webHidden/>
+              </w:rPr>
+              <w:fldChar w:fldCharType="begin"/>
+            </w:r>
+            <w:r>
+              <w:rPr>
+                <w:noProof/>
+                <w:webHidden/>
+              </w:rPr>
+              <w:instrText xml:space="preserve"> PAGEREF _Toc237592545 \h </w:instrText>
+            </w:r>
+            <w:r>
+              <w:rPr>
+                <w:noProof/>
+                <w:webHidden/>
+              </w:rPr>
+            </w:r>
+            <w:r>
+              <w:rPr>
+                <w:noProof/>
+                <w:webHidden/>
+              </w:rPr>
+              <w:fldChar w:fldCharType="separate"/>
+            </w:r>
+            <w:r>
+              <w:rPr>
+                <w:noProof/>
+                <w:webHidden/>
+              </w:rPr>
+              <w:t>5</w:t>
+            </w:r>
+            <w:r>
+              <w:rPr>
+                <w:noProof/>
+                <w:webHidden/>
+              </w:rPr>
+              <w:fldChar w:fldCharType="end"/>
+            </w:r>
+          </w:hyperlink>
+        </w:p>
+        <w:p>
+          <w:pPr>
+            <w:pStyle w:val="TOC2"/>
+            <w:tabs>
+              <w:tab w:val="right" w:leader="dot" w:pos="9605"/>
+            </w:tabs>
+            <w:rPr>
+              <w:rFonts w:eastAsiaTheme="minorEastAsia"/>
+              <w:noProof/>
+              <w:lang w:eastAsia="en-TZ"/>
+            </w:rPr>
+          </w:pPr>
+          <w:hyperlink w:anchor="_Toc237592546" w:history="1">
+            <w:r>
+              <w:rPr>
+                <w:rStyle w:val="Hyperlink"/>
+                <w:rFonts w:ascii="Book Antiqua" w:hAnsi="Book Antiqua"/>
+                <w:noProof/>
+              </w:rPr>
+              <w:t>Phase 2:</w:t>
+            </w:r>
+            <w:r>
+              <w:rPr>
+                <w:noProof/>
+                <w:webHidden/>
+              </w:rPr>
+              <w:tab/>
+            </w:r>
+            <w:r>
+              <w:rPr>
+                <w:noProof/>
+                <w:webHidden/>
+              </w:rPr>
+              <w:fldChar w:fldCharType="begin"/>
+            </w:r>
+            <w:r>
+              <w:rPr>
+                <w:noProof/>
+                <w:webHidden/>
+              </w:rPr>
+              <w:instrText xml:space="preserve"> PAGEREF _Toc237592546 \h </w:instrText>
+            </w:r>
+            <w:r>
+              <w:rPr>
+                <w:noProof/>
+                <w:webHidden/>
+              </w:rPr>
+            </w:r>
+            <w:r>
+              <w:rPr>
+                <w:noProof/>
+                <w:webHidden/>
+              </w:rPr>
+              <w:fldChar w:fldCharType="separate"/>
+            </w:r>
+            <w:r>
+              <w:rPr>
+                <w:noProof/>
+                <w:webHidden/>
+              </w:rPr>
+              <w:t>5</w:t>
+            </w:r>
+            <w:r>
+              <w:rPr>
+                <w:noProof/>
+                <w:webHidden/>
+              </w:rPr>
+              <w:fldChar w:fldCharType="end"/>
+            </w:r>
+          </w:hyperlink>
+        </w:p>
+        <w:p>
+          <w:pPr>
+            <w:pStyle w:val="TOC2"/>
+            <w:tabs>
+              <w:tab w:val="right" w:leader="dot" w:pos="9605"/>
+            </w:tabs>
+            <w:rPr>
+              <w:rFonts w:eastAsiaTheme="minorEastAsia"/>
+              <w:noProof/>
+              <w:lang w:eastAsia="en-TZ"/>
+            </w:rPr>
+          </w:pPr>
+          <w:hyperlink w:anchor="_Toc237592547" w:history="1">
+            <w:r>
+              <w:rPr>
+                <w:rStyle w:val="Hyperlink"/>
+                <w:rFonts w:ascii="Book Antiqua" w:hAnsi="Book Antiqua"/>
+                <w:noProof/>
+              </w:rPr>
+              <w:t>Phase 3:</w:t>
+            </w:r>
+            <w:r>
+              <w:rPr>
+                <w:noProof/>
+                <w:webHidden/>
+              </w:rPr>
+              <w:tab/>
+            </w:r>
+            <w:r>
+              <w:rPr>
+                <w:noProof/>
+                <w:webHidden/>
+              </w:rPr>
+              <w:fldChar w:fldCharType="begin"/>
+            </w:r>
+            <w:r>
+              <w:rPr>
+                <w:noProof/>
+                <w:webHidden/>
+              </w:rPr>
+              <w:instrText xml:space="preserve"> PAGEREF _Toc237592547 \h </w:instrText>
+            </w:r>
+            <w:r>
+              <w:rPr>
+                <w:noProof/>
+                <w:webHidden/>
+              </w:rPr>
+            </w:r>
+            <w:r>
+              <w:rPr>
+                <w:noProof/>
+                <w:webHidden/>
+              </w:rPr>
+              <w:fldChar w:fldCharType="separate"/>
+            </w:r>
+            <w:r>
+              <w:rPr>
+                <w:noProof/>
+                <w:webHidden/>
+              </w:rPr>
+              <w:t>5</w:t>
+            </w:r>
+            <w:r>
+              <w:rPr>
+                <w:noProof/>
+                <w:webHidden/>
+              </w:rPr>
+              <w:fldChar w:fldCharType="end"/>
+            </w:r>
+          </w:hyperlink>
+        </w:p>
+        <w:p>
+          <w:pPr>
+            <w:pStyle w:val="TOC2"/>
+            <w:tabs>
+              <w:tab w:val="right" w:leader="dot" w:pos="9605"/>
+            </w:tabs>
+            <w:rPr>
+              <w:rFonts w:eastAsiaTheme="minorEastAsia"/>
+              <w:noProof/>
+              <w:lang w:eastAsia="en-TZ"/>
+            </w:rPr>
+          </w:pPr>
+          <w:hyperlink w:anchor="_Toc237592548" w:history="1">
+            <w:r>
+              <w:rPr>
+                <w:rStyle w:val="Hyperlink"/>
+                <w:rFonts w:ascii="Book Antiqua" w:hAnsi="Book Antiqua"/>
+                <w:noProof/>
+              </w:rPr>
+              <w:t>Phase 4:</w:t>
+            </w:r>
+            <w:r>
+              <w:rPr>
+                <w:noProof/>
+                <w:webHidden/>
+              </w:rPr>
+              <w:tab/>
+            </w:r>
+            <w:r>
+              <w:rPr>
+                <w:noProof/>
+                <w:webHidden/>
+              </w:rPr>
+              <w:fldChar w:fldCharType="begin"/>
+            </w:r>
+            <w:r>
+              <w:rPr>
+                <w:noProof/>
+                <w:webHidden/>
+              </w:rPr>
+              <w:instrText xml:space="preserve"> PAGEREF _Toc237592548 \h </w:instrText>
+            </w:r>
+            <w:r>
+              <w:rPr>
+                <w:noProof/>
+                <w:webHidden/>
+              </w:rPr>
+            </w:r>
+            <w:r>
+              <w:rPr>
+                <w:noProof/>
+                <w:webHidden/>
+              </w:rPr>
+              <w:fldChar w:fldCharType="separate"/>
+            </w:r>
+            <w:r>
+              <w:rPr>
+                <w:noProof/>
+                <w:webHidden/>
+              </w:rPr>
+              <w:t>5</w:t>
+            </w:r>
+            <w:r>
+              <w:rPr>
+                <w:noProof/>
+                <w:webHidden/>
+              </w:rPr>
+              <w:fldChar w:fldCharType="end"/>
+            </w:r>
+          </w:hyperlink>
+        </w:p>
+        <w:p>
+          <w:pPr>
+            <w:pStyle w:val="TOC2"/>
+            <w:tabs>
+              <w:tab w:val="right" w:leader="dot" w:pos="9605"/>
+            </w:tabs>
+            <w:rPr>
+              <w:rFonts w:eastAsiaTheme="minorEastAsia"/>
+              <w:noProof/>
+              <w:lang w:eastAsia="en-TZ"/>
+            </w:rPr>
+          </w:pPr>
+          <w:hyperlink w:anchor="_Toc237592549" w:history="1">
+            <w:r>
+              <w:rPr>
+                <w:rStyle w:val="Hyperlink"/>
+                <w:rFonts w:ascii="Book Antiqua" w:hAnsi="Book Antiqua"/>
+                <w:noProof/>
+              </w:rPr>
+              <w:t>Phase 5:</w:t>
+            </w:r>
+            <w:r>
+              <w:rPr>
+                <w:noProof/>
+                <w:webHidden/>
+              </w:rPr>
+              <w:tab/>
+            </w:r>
+            <w:r>
+              <w:rPr>
+                <w:noProof/>
+                <w:webHidden/>
+              </w:rPr>
+              <w:fldChar w:fldCharType="begin"/>
+            </w:r>
+            <w:r>
+              <w:rPr>
+                <w:noProof/>
+                <w:webHidden/>
+              </w:rPr>
+              <w:instrText xml:space="preserve"> PAGEREF _Toc237592549 \h </w:instrText>
+            </w:r>
+            <w:r>
+              <w:rPr>
+                <w:noProof/>
+                <w:webHidden/>
+              </w:rPr>
+            </w:r>
+            <w:r>
+              <w:rPr>
+                <w:noProof/>
+                <w:webHidden/>
+              </w:rPr>
+              <w:fldChar w:fldCharType="separate"/>
+            </w:r>
+            <w:r>
+              <w:rPr>
+                <w:noProof/>
+                <w:webHidden/>
+              </w:rPr>
+              <w:t>6</w:t>
+            </w:r>
+            <w:r>
+              <w:rPr>
+                <w:noProof/>
+                <w:webHidden/>
+              </w:rPr>
+              <w:fldChar w:fldCharType="end"/>
+            </w:r>
+          </w:hyperlink>
+        </w:p>
+        <w:p>
+          <w:r>
+            <w:rPr>
+              <w:b/>
+              <w:bCs/>
+              <w:noProof/>
+            </w:rPr>
+            <w:fldChar w:fldCharType="end"/>
+          </w:r>
+        </w:p>
+      </w:sdtContent>
+    </w:sdt>
+    <w:p>
+      <w:pPr>
+        <w:rPr>
+          <w:rFonts w:ascii="Book Antiqua" w:hAnsi="Book Antiqua"/>
+        </w:rPr>
+      </w:pPr>
+      <w:r>
+        <w:rPr>
+          <w:rFonts w:ascii="Book Antiqua" w:hAnsi="Book Antiqua"/>
+        </w:rPr>
+        <w:br w:type="page"/>
+      </w:r>
+    </w:p>
+    <w:p>
+      <w:pPr>
+        <w:pStyle w:val="Heading1"/>
+        <w:rPr>
+          <w:rFonts w:ascii="Book Antiqua" w:hAnsi="Book Antiqua"/>
+        </w:rPr>
+      </w:pPr>
+      <w:bookmarkStart w:id="0" w:name="_Toc237592540"/>
+      <w:r>
+        <w:rPr>
+          <w:rFonts w:ascii="Book Antiqua" w:hAnsi="Book Antiqua"/>
+        </w:rPr>
+        <w:lastRenderedPageBreak/>
         <w:t>CLIENT DETAILS</w:t>
       </w:r>
+      <w:bookmarkEnd w:id="0"/>
     </w:p>
     <w:p>
       <w:pPr>
@@ -37,12 +840,22 @@
     </w:p>
     <w:p>
       <w:pPr>
-        <w:pStyle w:val="Heading2"/>
-        <w:rPr>
-          <w:rFonts w:ascii="Book Antiqua" w:hAnsi="Book Antiqua"/>
-          <w:lang w:val="en-US"/>
-        </w:rPr>
-      </w:pPr>
+        <w:rPr>
+          <w:rFonts w:ascii="Book Antiqua" w:hAnsi="Book Antiqua"/>
+          <w:sz w:val="28"/>
+          <w:lang w:val="en-US"/>
+        </w:rPr>
+      </w:pPr>
+    </w:p>
+    <w:p>
+      <w:pPr>
+        <w:pStyle w:val="Heading1"/>
+        <w:rPr>
+          <w:rFonts w:ascii="Book Antiqua" w:hAnsi="Book Antiqua"/>
+          <w:lang w:val="en-US"/>
+        </w:rPr>
+      </w:pPr>
+      <w:bookmarkStart w:id="1" w:name="_Toc237592541"/>
       <w:r>
         <w:rPr>
           <w:rFonts w:ascii="Book Antiqua" w:hAnsi="Book Antiqua"/>
@@ -57,6 +870,7 @@
         </w:rPr>
         <w:t>’S BUSINESS PROCESS NARRATION.</w:t>
       </w:r>
+      <w:bookmarkEnd w:id="1"/>
     </w:p>
     <w:p>
       <w:pPr>
@@ -88,7 +902,55 @@
           <w:sz w:val="28"/>
           <w:lang w:val="en-US"/>
         </w:rPr>
-        <w:t>operating a product-ordering business from China, where she helps small-scale sellers obtain products from different countries without requiring them to travel themselves. She manages a large group of sellers through WhatsApp, where sellers communicate their product requests and place orders. However,</w:t>
+        <w:t xml:space="preserve">operating a product-ordering business from China, where she helps small-scale </w:t>
+      </w:r>
+      <w:r>
+        <w:rPr>
+          <w:rFonts w:ascii="Book Antiqua" w:hAnsi="Book Antiqua"/>
+          <w:sz w:val="28"/>
+          <w:lang w:val="en-US"/>
+        </w:rPr>
+        <w:t>customers</w:t>
+      </w:r>
+      <w:r>
+        <w:rPr>
+          <w:rFonts w:ascii="Book Antiqua" w:hAnsi="Book Antiqua"/>
+          <w:sz w:val="28"/>
+          <w:lang w:val="en-US"/>
+        </w:rPr>
+        <w:t xml:space="preserve"> obtain products from different countries without requiring them to travel themselves. She manages a large group of </w:t>
+      </w:r>
+      <w:r>
+        <w:rPr>
+          <w:rFonts w:ascii="Book Antiqua" w:hAnsi="Book Antiqua"/>
+          <w:sz w:val="28"/>
+          <w:lang w:val="en-US"/>
+        </w:rPr>
+        <w:t>customers through</w:t>
+      </w:r>
+      <w:r>
+        <w:rPr>
+          <w:rFonts w:ascii="Book Antiqua" w:hAnsi="Book Antiqua"/>
+          <w:sz w:val="28"/>
+          <w:lang w:val="en-US"/>
+        </w:rPr>
+        <w:t xml:space="preserve"> WhatsApp, where</w:t>
+      </w:r>
+      <w:r>
+        <w:rPr>
+          <w:rFonts w:ascii="Book Antiqua" w:hAnsi="Book Antiqua"/>
+          <w:sz w:val="28"/>
+          <w:lang w:val="en-US"/>
+        </w:rPr>
+        <w:t xml:space="preserve"> customers </w:t>
+      </w:r>
+      <w:r>
+        <w:rPr>
+          <w:rFonts w:ascii="Book Antiqua" w:hAnsi="Book Antiqua"/>
+          <w:sz w:val="28"/>
+          <w:lang w:val="en-US"/>
+        </w:rPr>
+        <w:t>communicate their product requests and place orders. However,</w:t>
       </w:r>
       <w:r>
         <w:rPr>
@@ -104,26 +966,51 @@
           <w:sz w:val="28"/>
           <w:lang w:val="en-US"/>
         </w:rPr>
-        <w:t xml:space="preserve"> currently relies on handwritten records and WhatsApp conversations to manage sellers, products and orders. </w:t>
-      </w:r>
-    </w:p>
-    <w:p>
-      <w:pPr>
-        <w:pStyle w:val="Heading3"/>
-        <w:rPr>
-          <w:rFonts w:ascii="Book Antiqua" w:hAnsi="Book Antiqua"/>
-          <w:sz w:val="32"/>
-          <w:lang w:val="en-US"/>
-        </w:rPr>
-      </w:pPr>
-      <w:r>
-        <w:rPr>
-          <w:rFonts w:ascii="Book Antiqua" w:hAnsi="Book Antiqua"/>
-          <w:sz w:val="32"/>
-          <w:lang w:val="en-US"/>
-        </w:rPr>
-        <w:t>Business process challenges facing client’s business</w:t>
-      </w:r>
+        <w:t xml:space="preserve"> currently relies on handwritten records and WhatsApp conversations to manage</w:t>
+      </w:r>
+      <w:r>
+        <w:rPr>
+          <w:rFonts w:ascii="Book Antiqua" w:hAnsi="Book Antiqua"/>
+          <w:sz w:val="28"/>
+          <w:lang w:val="en-US"/>
+        </w:rPr>
+        <w:t xml:space="preserve"> customers</w:t>
+      </w:r>
+      <w:r>
+        <w:rPr>
+          <w:rFonts w:ascii="Book Antiqua" w:hAnsi="Book Antiqua"/>
+          <w:sz w:val="28"/>
+          <w:lang w:val="en-US"/>
+        </w:rPr>
+        <w:t xml:space="preserve">, products and orders. </w:t>
+      </w:r>
+    </w:p>
+    <w:p>
+      <w:pPr>
+        <w:rPr>
+          <w:rFonts w:ascii="Book Antiqua" w:hAnsi="Book Antiqua"/>
+          <w:sz w:val="28"/>
+          <w:lang w:val="en-US"/>
+        </w:rPr>
+      </w:pPr>
+    </w:p>
+    <w:p>
+      <w:pPr>
+        <w:pStyle w:val="Heading1"/>
+        <w:rPr>
+          <w:rFonts w:ascii="Book Antiqua" w:hAnsi="Book Antiqua"/>
+          <w:lang w:val="en-US"/>
+        </w:rPr>
+      </w:pPr>
+      <w:bookmarkStart w:id="2" w:name="_Toc237592542"/>
+      <w:r>
+        <w:rPr>
+          <w:rFonts w:ascii="Book Antiqua" w:hAnsi="Book Antiqua"/>
+          <w:lang w:val="en-US"/>
+        </w:rPr>
+        <w:t>BUSINESS PROCESS CHALLENGES CLIENT FACES.</w:t>
+      </w:r>
+      <w:bookmarkEnd w:id="2"/>
     </w:p>
     <w:p>
       <w:pPr>
@@ -147,7 +1034,23 @@
           <w:sz w:val="28"/>
           <w:lang w:val="en-US"/>
         </w:rPr>
-        <w:t xml:space="preserve"> says that as the number of sellers, products and orders increases, it becomes difficult to accurately record, retrieve, organize and track orders and their history.</w:t>
+        <w:t xml:space="preserve"> says that as the number of </w:t>
+      </w:r>
+      <w:r>
+        <w:rPr>
+          <w:rFonts w:ascii="Book Antiqua" w:hAnsi="Book Antiqua"/>
+          <w:sz w:val="28"/>
+          <w:lang w:val="en-US"/>
+        </w:rPr>
+        <w:t>customers</w:t>
+      </w:r>
+      <w:r>
+        <w:rPr>
+          <w:rFonts w:ascii="Book Antiqua" w:hAnsi="Book Antiqua"/>
+          <w:sz w:val="28"/>
+          <w:lang w:val="en-US"/>
+        </w:rPr>
+        <w:t>, products and orders increases, it becomes difficult to accurately record, retrieve, organize and track orders and their history.</w:t>
       </w:r>
     </w:p>
     <w:p>
@@ -186,28 +1089,36 @@
     <w:p>
       <w:pPr>
         <w:rPr>
-          <w:lang w:val="en-US"/>
-        </w:rPr>
-      </w:pPr>
-    </w:p>
-    <w:p>
-      <w:pPr>
-        <w:rPr>
-          <w:rFonts w:ascii="Book Antiqua" w:hAnsi="Book Antiqua"/>
-          <w:color w:val="FF0000"/>
-          <w:sz w:val="28"/>
-          <w:lang w:val="en-US"/>
-        </w:rPr>
-      </w:pPr>
-      <w:r>
-        <w:rPr>
-          <w:rFonts w:ascii="Book Antiqua" w:hAnsi="Book Antiqua"/>
-          <w:color w:val="FF0000"/>
-          <w:sz w:val="28"/>
-          <w:lang w:val="en-US"/>
-        </w:rPr>
-        <w:t>Suggested business solution to the problem.</w:t>
-      </w:r>
+          <w:rFonts w:ascii="Book Antiqua" w:hAnsi="Book Antiqua"/>
+          <w:sz w:val="28"/>
+          <w:lang w:val="en-US"/>
+        </w:rPr>
+      </w:pPr>
+    </w:p>
+    <w:p>
+      <w:pPr>
+        <w:pStyle w:val="Heading1"/>
+        <w:rPr>
+          <w:rFonts w:ascii="Book Antiqua" w:hAnsi="Book Antiqua"/>
+          <w:lang w:val="en-US"/>
+        </w:rPr>
+      </w:pPr>
+      <w:bookmarkStart w:id="3" w:name="_Toc237592543"/>
+      <w:r>
+        <w:rPr>
+          <w:rFonts w:ascii="Book Antiqua" w:hAnsi="Book Antiqua"/>
+          <w:lang w:val="en-US"/>
+        </w:rPr>
+        <w:t>SUGGESTE</w:t>
+      </w:r>
+      <w:r>
+        <w:rPr>
+          <w:rFonts w:ascii="Book Antiqua" w:hAnsi="Book Antiqua"/>
+          <w:lang w:val="en-US"/>
+        </w:rPr>
+        <w:t>D SOLUTIONS TO THE CLIENT’S CUSTOMERS.</w:t>
+      </w:r>
+      <w:bookmarkEnd w:id="3"/>
     </w:p>
     <w:p>
       <w:pPr>
@@ -239,24 +1150,88 @@
           <w:sz w:val="28"/>
           <w:lang w:val="en-US"/>
         </w:rPr>
-        <w:t xml:space="preserve"> who is the administrator to: register sellers, record/receive orders, add product information, update order status, search order history and view seller records.</w:t>
-      </w:r>
-    </w:p>
-    <w:p>
-      <w:pPr>
-        <w:rPr>
-          <w:rFonts w:ascii="Book Antiqua" w:hAnsi="Book Antiqua"/>
-          <w:sz w:val="28"/>
-          <w:lang w:val="en-US"/>
-        </w:rPr>
-      </w:pPr>
-      <w:r>
-        <w:rPr>
-          <w:rFonts w:ascii="Book Antiqua" w:hAnsi="Book Antiqua"/>
-          <w:sz w:val="28"/>
-          <w:lang w:val="en-US"/>
-        </w:rPr>
-        <w:t>While on the seller’s side, the app should enable sellers/customers to: place order, provide product requirements, view their order information/status and check previous orders.</w:t>
+        <w:t xml:space="preserve"> who is the administrator to: register </w:t>
+      </w:r>
+      <w:r>
+        <w:rPr>
+          <w:rFonts w:ascii="Book Antiqua" w:hAnsi="Book Antiqua"/>
+          <w:sz w:val="28"/>
+          <w:lang w:val="en-US"/>
+        </w:rPr>
+        <w:t>customers</w:t>
+      </w:r>
+      <w:r>
+        <w:rPr>
+          <w:rFonts w:ascii="Book Antiqua" w:hAnsi="Book Antiqua"/>
+          <w:sz w:val="28"/>
+          <w:lang w:val="en-US"/>
+        </w:rPr>
+        <w:t xml:space="preserve">, record/receive orders, add product information, update order status, search order history and view </w:t>
+      </w:r>
+      <w:r>
+        <w:rPr>
+          <w:rFonts w:ascii="Book Antiqua" w:hAnsi="Book Antiqua"/>
+          <w:sz w:val="28"/>
+          <w:lang w:val="en-US"/>
+        </w:rPr>
+        <w:t>customers</w:t>
+      </w:r>
+      <w:r>
+        <w:rPr>
+          <w:rFonts w:ascii="Book Antiqua" w:hAnsi="Book Antiqua"/>
+          <w:sz w:val="28"/>
+          <w:lang w:val="en-US"/>
+        </w:rPr>
+        <w:t xml:space="preserve"> records.</w:t>
+      </w:r>
+    </w:p>
+    <w:p>
+      <w:pPr>
+        <w:rPr>
+          <w:rFonts w:ascii="Book Antiqua" w:hAnsi="Book Antiqua"/>
+          <w:sz w:val="28"/>
+          <w:lang w:val="en-US"/>
+        </w:rPr>
+      </w:pPr>
+      <w:r>
+        <w:rPr>
+          <w:rFonts w:ascii="Book Antiqua" w:hAnsi="Book Antiqua"/>
+          <w:sz w:val="28"/>
+          <w:lang w:val="en-US"/>
+        </w:rPr>
+        <w:t xml:space="preserve">While on the </w:t>
+      </w:r>
+      <w:r>
+        <w:rPr>
+          <w:rFonts w:ascii="Book Antiqua" w:hAnsi="Book Antiqua"/>
+          <w:sz w:val="28"/>
+          <w:lang w:val="en-US"/>
+        </w:rPr>
+        <w:t>customers</w:t>
+      </w:r>
+      <w:r>
+        <w:rPr>
+          <w:rFonts w:ascii="Book Antiqua" w:hAnsi="Book Antiqua"/>
+          <w:sz w:val="28"/>
+          <w:lang w:val="en-US"/>
+        </w:rPr>
+        <w:t xml:space="preserve">’ side, the app should enable </w:t>
+      </w:r>
+      <w:r>
+        <w:rPr>
+          <w:rFonts w:ascii="Book Antiqua" w:hAnsi="Book Antiqua"/>
+          <w:sz w:val="28"/>
+          <w:lang w:val="en-US"/>
+        </w:rPr>
+        <w:t xml:space="preserve">her </w:t>
+      </w:r>
+      <w:r>
+        <w:rPr>
+          <w:rFonts w:ascii="Book Antiqua" w:hAnsi="Book Antiqua"/>
+          <w:sz w:val="28"/>
+          <w:lang w:val="en-US"/>
+        </w:rPr>
+        <w:t>customers to: place order, provide product requirements, view their order information/status and check previous orders.</w:t>
       </w:r>
     </w:p>
     <w:p>
@@ -290,7 +1265,15 @@
           <w:sz w:val="28"/>
           <w:lang w:val="en-US"/>
         </w:rPr>
-        <w:t xml:space="preserve">Seller </w:t>
+        <w:t>Customer</w:t>
+      </w:r>
+      <w:r>
+        <w:rPr>
+          <w:rFonts w:ascii="Book Antiqua" w:hAnsi="Book Antiqua"/>
+          <w:sz w:val="28"/>
+          <w:lang w:val="en-US"/>
+        </w:rPr>
+        <w:t xml:space="preserve"> </w:t>
       </w:r>
       <w:r>
         <w:rPr>
@@ -346,6 +1329,38 @@
           <w:sz w:val="28"/>
           <w:lang w:val="en-US"/>
         </w:rPr>
+        <w:t>Client receives</w:t>
+      </w:r>
+      <w:r>
+        <w:rPr>
+          <w:rFonts w:ascii="Book Antiqua" w:hAnsi="Book Antiqua"/>
+          <w:sz w:val="28"/>
+          <w:lang w:val="en-US"/>
+        </w:rPr>
+        <w:t xml:space="preserve"> order </w:t>
+      </w:r>
+      <w:r>
+        <w:rPr>
+          <w:rFonts w:ascii="Book Antiqua" w:hAnsi="Book Antiqua"/>
+          <w:sz w:val="28"/>
+          <w:lang w:val="en-US"/>
+        </w:rPr>
+        <w:sym w:font="Wingdings" w:char="F0E0"/>
+      </w:r>
+      <w:r>
+        <w:rPr>
+          <w:rFonts w:ascii="Book Antiqua" w:hAnsi="Book Antiqua"/>
+          <w:sz w:val="28"/>
+          <w:lang w:val="en-US"/>
+        </w:rPr>
+        <w:t xml:space="preserve"> </w:t>
+      </w:r>
+      <w:r>
+        <w:rPr>
+          <w:rFonts w:ascii="Book Antiqua" w:hAnsi="Book Antiqua"/>
+          <w:sz w:val="28"/>
+          <w:lang w:val="en-US"/>
+        </w:rPr>
         <w:t>Client</w:t>
       </w:r>
       <w:r>
@@ -354,15 +1369,7 @@
           <w:sz w:val="28"/>
           <w:lang w:val="en-US"/>
         </w:rPr>
-        <w:t xml:space="preserve"> receives</w:t>
-      </w:r>
-      <w:r>
-        <w:rPr>
-          <w:rFonts w:ascii="Book Antiqua" w:hAnsi="Book Antiqua"/>
-          <w:sz w:val="28"/>
-          <w:lang w:val="en-US"/>
-        </w:rPr>
-        <w:t xml:space="preserve"> order </w:t>
+        <w:t xml:space="preserve"> confirms </w:t>
       </w:r>
       <w:r>
         <w:rPr>
@@ -378,6 +1385,38 @@
           <w:sz w:val="28"/>
           <w:lang w:val="en-US"/>
         </w:rPr>
+        <w:t xml:space="preserve"> Order is processed </w:t>
+      </w:r>
+      <w:r>
+        <w:rPr>
+          <w:rFonts w:ascii="Book Antiqua" w:hAnsi="Book Antiqua"/>
+          <w:sz w:val="28"/>
+          <w:lang w:val="en-US"/>
+        </w:rPr>
+        <w:sym w:font="Wingdings" w:char="F0E0"/>
+      </w:r>
+      <w:r>
+        <w:rPr>
+          <w:rFonts w:ascii="Book Antiqua" w:hAnsi="Book Antiqua"/>
+          <w:sz w:val="28"/>
+          <w:lang w:val="en-US"/>
+        </w:rPr>
+        <w:t xml:space="preserve"> Status updated </w:t>
+      </w:r>
+      <w:r>
+        <w:rPr>
+          <w:rFonts w:ascii="Book Antiqua" w:hAnsi="Book Antiqua"/>
+          <w:sz w:val="28"/>
+          <w:lang w:val="en-US"/>
+        </w:rPr>
+        <w:sym w:font="Wingdings" w:char="F0E0"/>
+      </w:r>
+      <w:r>
+        <w:rPr>
+          <w:rFonts w:ascii="Book Antiqua" w:hAnsi="Book Antiqua"/>
+          <w:sz w:val="28"/>
+          <w:lang w:val="en-US"/>
+        </w:rPr>
         <w:t xml:space="preserve"> </w:t>
       </w:r>
       <w:r>
@@ -386,82 +1425,16 @@
           <w:sz w:val="28"/>
           <w:lang w:val="en-US"/>
         </w:rPr>
-        <w:t>Client</w:t>
-      </w:r>
-      <w:r>
-        <w:rPr>
-          <w:rFonts w:ascii="Book Antiqua" w:hAnsi="Book Antiqua"/>
-          <w:sz w:val="28"/>
-          <w:lang w:val="en-US"/>
-        </w:rPr>
-        <w:t xml:space="preserve"> confirms </w:t>
-      </w:r>
-      <w:r>
-        <w:rPr>
-          <w:rFonts w:ascii="Book Antiqua" w:hAnsi="Book Antiqua"/>
-          <w:sz w:val="28"/>
-          <w:lang w:val="en-US"/>
-        </w:rPr>
-        <w:sym w:font="Wingdings" w:char="F0E0"/>
-      </w:r>
-      <w:r>
-        <w:rPr>
-          <w:rFonts w:ascii="Book Antiqua" w:hAnsi="Book Antiqua"/>
-          <w:sz w:val="28"/>
-          <w:lang w:val="en-US"/>
-        </w:rPr>
-        <w:t xml:space="preserve"> Order is processed </w:t>
-      </w:r>
-      <w:r>
-        <w:rPr>
-          <w:rFonts w:ascii="Book Antiqua" w:hAnsi="Book Antiqua"/>
-          <w:sz w:val="28"/>
-          <w:lang w:val="en-US"/>
-        </w:rPr>
-        <w:sym w:font="Wingdings" w:char="F0E0"/>
-      </w:r>
-      <w:r>
-        <w:rPr>
-          <w:rFonts w:ascii="Book Antiqua" w:hAnsi="Book Antiqua"/>
-          <w:sz w:val="28"/>
-          <w:lang w:val="en-US"/>
-        </w:rPr>
-        <w:t xml:space="preserve"> Status updated </w:t>
-      </w:r>
-      <w:r>
-        <w:rPr>
-          <w:rFonts w:ascii="Book Antiqua" w:hAnsi="Book Antiqua"/>
-          <w:sz w:val="28"/>
-          <w:lang w:val="en-US"/>
-        </w:rPr>
-        <w:sym w:font="Wingdings" w:char="F0E0"/>
-      </w:r>
-      <w:r>
-        <w:rPr>
-          <w:rFonts w:ascii="Book Antiqua" w:hAnsi="Book Antiqua"/>
-          <w:sz w:val="28"/>
-          <w:lang w:val="en-US"/>
-        </w:rPr>
-        <w:t xml:space="preserve"> Seller sees status.</w:t>
-      </w:r>
-    </w:p>
-    <w:p>
-      <w:pPr>
-        <w:rPr>
-          <w:rFonts w:ascii="Book Antiqua" w:hAnsi="Book Antiqua"/>
-          <w:sz w:val="28"/>
-          <w:lang w:val="en-US"/>
-        </w:rPr>
-      </w:pPr>
-    </w:p>
-    <w:p>
-      <w:pPr>
-        <w:rPr>
-          <w:rFonts w:ascii="Book Antiqua" w:hAnsi="Book Antiqua"/>
-          <w:sz w:val="28"/>
-          <w:lang w:val="en-US"/>
-        </w:rPr>
-      </w:pPr>
+        <w:t>Customers</w:t>
+      </w:r>
+      <w:r>
+        <w:rPr>
+          <w:rFonts w:ascii="Book Antiqua" w:hAnsi="Book Antiqua"/>
+          <w:sz w:val="28"/>
+          <w:lang w:val="en-US"/>
+        </w:rPr>
+        <w:t xml:space="preserve"> sees status</w:t>
+      </w:r>
     </w:p>
     <w:p>
       <w:pPr>
@@ -469,14 +1442,28 @@
         <w:rPr>
           <w:rFonts w:ascii="Book Antiqua" w:hAnsi="Book Antiqua"/>
           <w:b/>
-          <w:sz w:val="28"/>
-          <w:lang w:val="en-US"/>
-        </w:rPr>
-      </w:pPr>
-      <w:r>
+          <w:i/>
+          <w:sz w:val="28"/>
+          <w:lang w:val="en-US"/>
+        </w:rPr>
+      </w:pPr>
+    </w:p>
+    <w:p>
+      <w:pPr>
+        <w:jc w:val="center"/>
         <w:rPr>
           <w:rFonts w:ascii="Book Antiqua" w:hAnsi="Book Antiqua"/>
           <w:b/>
+          <w:i/>
+          <w:sz w:val="28"/>
+          <w:lang w:val="en-US"/>
+        </w:rPr>
+      </w:pPr>
+      <w:r>
+        <w:rPr>
+          <w:rFonts w:ascii="Book Antiqua" w:hAnsi="Book Antiqua"/>
+          <w:b/>
+          <w:i/>
           <w:sz w:val="28"/>
           <w:lang w:val="en-US"/>
         </w:rPr>
@@ -507,7 +1494,23 @@
           <w:sz w:val="28"/>
           <w:lang w:val="en-US"/>
         </w:rPr>
-        <w:t>AgizaSafe –A Digital Order Management System for small-scale sellers.</w:t>
+        <w:t xml:space="preserve">AgizaSafe –A Digital Order Management System for small-scale </w:t>
+      </w:r>
+      <w:r>
+        <w:rPr>
+          <w:rFonts w:ascii="Book Antiqua" w:hAnsi="Book Antiqua"/>
+          <w:sz w:val="28"/>
+          <w:lang w:val="en-US"/>
+        </w:rPr>
+        <w:t>customers</w:t>
+      </w:r>
+      <w:r>
+        <w:rPr>
+          <w:rFonts w:ascii="Book Antiqua" w:hAnsi="Book Antiqua"/>
+          <w:sz w:val="28"/>
+          <w:lang w:val="en-US"/>
+        </w:rPr>
+        <w:t>.</w:t>
       </w:r>
     </w:p>
     <w:p>
@@ -779,7 +1782,23 @@
           <w:sz w:val="28"/>
           <w:lang w:val="en-US"/>
         </w:rPr>
-        <w:t>: Seller should be able enter product name, product category, brand, quantity, size, color, product image, description. Then submit order. Lisa then receives order.</w:t>
+        <w:t xml:space="preserve">: </w:t>
+      </w:r>
+      <w:r>
+        <w:rPr>
+          <w:rFonts w:ascii="Book Antiqua" w:hAnsi="Book Antiqua"/>
+          <w:sz w:val="28"/>
+          <w:lang w:val="en-US"/>
+        </w:rPr>
+        <w:t>Customer</w:t>
+      </w:r>
+      <w:r>
+        <w:rPr>
+          <w:rFonts w:ascii="Book Antiqua" w:hAnsi="Book Antiqua"/>
+          <w:sz w:val="28"/>
+          <w:lang w:val="en-US"/>
+        </w:rPr>
+        <w:t xml:space="preserve"> should be able enter product name, product category, brand, quantity, size, color, product image, description. Then submit order. Lisa then receives order.</w:t>
       </w:r>
     </w:p>
     <w:p>
@@ -809,7 +1828,23 @@
           <w:sz w:val="28"/>
           <w:lang w:val="en-US"/>
         </w:rPr>
-        <w:t>(Order Details); Lisa should be able to see: Order e.g. Order #AG001 Seller name, Product, quantity, brand, color, size, date. And lastly Status.</w:t>
+        <w:t xml:space="preserve">(Order Details); Lisa should be able to see: Order e.g. Order #AG001 </w:t>
+      </w:r>
+      <w:r>
+        <w:rPr>
+          <w:rFonts w:ascii="Book Antiqua" w:hAnsi="Book Antiqua"/>
+          <w:sz w:val="28"/>
+          <w:lang w:val="en-US"/>
+        </w:rPr>
+        <w:t>Customer</w:t>
+      </w:r>
+      <w:r>
+        <w:rPr>
+          <w:rFonts w:ascii="Book Antiqua" w:hAnsi="Book Antiqua"/>
+          <w:sz w:val="28"/>
+          <w:lang w:val="en-US"/>
+        </w:rPr>
+        <w:t xml:space="preserve"> name, Product, quantity, brand, color, size, date. And lastly Status.</w:t>
       </w:r>
     </w:p>
     <w:p>
@@ -935,7 +1970,23 @@
           <w:sz w:val="28"/>
           <w:lang w:val="en-US"/>
         </w:rPr>
-        <w:t xml:space="preserve">This helps seller to see where their order where it is currently. </w:t>
+        <w:t>This helps</w:t>
+      </w:r>
+      <w:r>
+        <w:rPr>
+          <w:rFonts w:ascii="Book Antiqua" w:hAnsi="Book Antiqua"/>
+          <w:sz w:val="28"/>
+          <w:lang w:val="en-US"/>
+        </w:rPr>
+        <w:t xml:space="preserve"> customers </w:t>
+      </w:r>
+      <w:r>
+        <w:rPr>
+          <w:rFonts w:ascii="Book Antiqua" w:hAnsi="Book Antiqua"/>
+          <w:sz w:val="28"/>
+          <w:lang w:val="en-US"/>
+        </w:rPr>
+        <w:t xml:space="preserve">to see where their order where it is currently. </w:t>
       </w:r>
     </w:p>
     <w:p>
@@ -981,7 +2032,23 @@
           <w:sz w:val="28"/>
           <w:lang w:val="en-US"/>
         </w:rPr>
-        <w:t>retrieve old records. App should show table containing order, product, Date, Quantity, Status. Lisa should also be able to search by seller, order ID, product, or date.</w:t>
+        <w:t xml:space="preserve">retrieve old records. App should show table containing order, product, Date, Quantity, Status. Lisa should also be able to search by </w:t>
+      </w:r>
+      <w:r>
+        <w:rPr>
+          <w:rFonts w:ascii="Book Antiqua" w:hAnsi="Book Antiqua"/>
+          <w:sz w:val="28"/>
+          <w:lang w:val="en-US"/>
+        </w:rPr>
+        <w:t>customer</w:t>
+      </w:r>
+      <w:r>
+        <w:rPr>
+          <w:rFonts w:ascii="Book Antiqua" w:hAnsi="Book Antiqua"/>
+          <w:sz w:val="28"/>
+          <w:lang w:val="en-US"/>
+        </w:rPr>
+        <w:t>, order ID, product, or date.</w:t>
       </w:r>
     </w:p>
     <w:p>
@@ -1008,12 +2075,21 @@
     </w:p>
     <w:p>
       <w:pPr>
-        <w:rPr>
-          <w:rFonts w:ascii="Book Antiqua" w:hAnsi="Book Antiqua"/>
-          <w:sz w:val="28"/>
-          <w:lang w:val="en-US"/>
-        </w:rPr>
-      </w:pPr>
+        <w:pStyle w:val="Heading1"/>
+        <w:rPr>
+          <w:rFonts w:ascii="Book Antiqua" w:hAnsi="Book Antiqua"/>
+          <w:lang w:val="en-US"/>
+        </w:rPr>
+      </w:pPr>
+      <w:bookmarkStart w:id="4" w:name="_Toc237592544"/>
+      <w:r>
+        <w:rPr>
+          <w:rFonts w:ascii="Book Antiqua" w:hAnsi="Book Antiqua"/>
+          <w:lang w:val="en-US"/>
+        </w:rPr>
+        <w:t>THE APPLICATION’S ROADMAP</w:t>
+      </w:r>
+      <w:bookmarkEnd w:id="4"/>
     </w:p>
     <w:p>
       <w:pPr>
@@ -1075,21 +2151,30 @@
           <w:lang w:val="en-US"/>
         </w:rPr>
       </w:pPr>
-      <w:r>
-        <w:rPr>
-          <w:rFonts w:ascii="Book Antiqua" w:hAnsi="Book Antiqua"/>
-          <w:sz w:val="28"/>
-          <w:lang w:val="en-US"/>
+      <w:bookmarkStart w:id="5" w:name="_Toc237592545"/>
+      <w:r>
+        <w:rPr>
+          <w:rStyle w:val="Heading2Char"/>
+          <w:rFonts w:ascii="Book Antiqua" w:hAnsi="Book Antiqua"/>
         </w:rPr>
         <w:t>Phase 1:</w:t>
       </w:r>
-      <w:r>
-        <w:rPr>
-          <w:rFonts w:ascii="Book Antiqua" w:hAnsi="Book Antiqua"/>
-          <w:sz w:val="28"/>
-          <w:lang w:val="en-US"/>
-        </w:rPr>
-        <w:t xml:space="preserve"> This establishes the database and basic business records.</w:t>
+      <w:bookmarkEnd w:id="5"/>
+      <w:r>
+        <w:rPr>
+          <w:rFonts w:ascii="Book Antiqua" w:hAnsi="Book Antiqua"/>
+          <w:sz w:val="32"/>
+          <w:lang w:val="en-US"/>
+        </w:rPr>
+        <w:t xml:space="preserve"> </w:t>
+      </w:r>
+      <w:r>
+        <w:rPr>
+          <w:rFonts w:ascii="Book Antiqua" w:hAnsi="Book Antiqua"/>
+          <w:sz w:val="28"/>
+          <w:lang w:val="en-US"/>
+        </w:rPr>
+        <w:t>This establishes the database and basic business records.</w:t>
       </w:r>
     </w:p>
     <w:p>
@@ -1111,7 +2196,23 @@
           <w:sz w:val="28"/>
           <w:lang w:val="en-US"/>
         </w:rPr>
-        <w:t>Client/Administration side development/Automation.</w:t>
+        <w:t>Administration</w:t>
+      </w:r>
+      <w:r>
+        <w:rPr>
+          <w:rFonts w:ascii="Book Antiqua" w:hAnsi="Book Antiqua"/>
+          <w:sz w:val="28"/>
+          <w:lang w:val="en-US"/>
+        </w:rPr>
+        <w:t>-</w:t>
+      </w:r>
+      <w:r>
+        <w:rPr>
+          <w:rFonts w:ascii="Book Antiqua" w:hAnsi="Book Antiqua"/>
+          <w:sz w:val="28"/>
+          <w:lang w:val="en-US"/>
+        </w:rPr>
+        <w:t>side development/Automation.</w:t>
       </w:r>
     </w:p>
     <w:p>
@@ -1133,7 +2234,15 @@
           <w:sz w:val="28"/>
           <w:lang w:val="en-US"/>
         </w:rPr>
-        <w:t>Sellers Registration</w:t>
+        <w:t xml:space="preserve">Customer </w:t>
+      </w:r>
+      <w:r>
+        <w:rPr>
+          <w:rFonts w:ascii="Book Antiqua" w:hAnsi="Book Antiqua"/>
+          <w:sz w:val="28"/>
+          <w:lang w:val="en-US"/>
+        </w:rPr>
+        <w:t>Registration</w:t>
       </w:r>
     </w:p>
     <w:p>
@@ -1149,13 +2258,31 @@
           <w:lang w:val="en-US"/>
         </w:rPr>
       </w:pPr>
-      <w:r>
-        <w:rPr>
-          <w:rFonts w:ascii="Book Antiqua" w:hAnsi="Book Antiqua"/>
-          <w:sz w:val="28"/>
-          <w:lang w:val="en-US"/>
-        </w:rPr>
-        <w:t>Names(three)</w:t>
+      <w:bookmarkStart w:id="6" w:name="_GoBack"/>
+      <w:bookmarkEnd w:id="6"/>
+      <w:r>
+        <w:rPr>
+          <w:rFonts w:ascii="Book Antiqua" w:hAnsi="Book Antiqua"/>
+          <w:sz w:val="28"/>
+          <w:lang w:val="en-US"/>
+        </w:rPr>
+        <w:t>Names (</w:t>
+      </w:r>
+      <w:r>
+        <w:rPr>
+          <w:rFonts w:ascii="Book Antiqua" w:hAnsi="Book Antiqua"/>
+          <w:sz w:val="28"/>
+          <w:lang w:val="en-US"/>
+        </w:rPr>
+        <w:t>First, middle and surname</w:t>
+      </w:r>
+      <w:r>
+        <w:rPr>
+          <w:rFonts w:ascii="Book Antiqua" w:hAnsi="Book Antiqua"/>
+          <w:sz w:val="28"/>
+          <w:lang w:val="en-US"/>
+        </w:rPr>
+        <w:t>)</w:t>
       </w:r>
     </w:p>
     <w:p>
@@ -1295,7 +2422,15 @@
           <w:sz w:val="28"/>
           <w:lang w:val="en-US"/>
         </w:rPr>
-        <w:t>View + Search Sellers</w:t>
+        <w:t xml:space="preserve">View + Search </w:t>
+      </w:r>
+      <w:r>
+        <w:rPr>
+          <w:rFonts w:ascii="Book Antiqua" w:hAnsi="Book Antiqua"/>
+          <w:sz w:val="28"/>
+          <w:lang w:val="en-US"/>
+        </w:rPr>
+        <w:t>Customer</w:t>
       </w:r>
     </w:p>
     <w:p>
@@ -1311,6 +2446,14 @@
           <w:lang w:val="en-US"/>
         </w:rPr>
       </w:pPr>
+      <w:r>
+        <w:rPr>
+          <w:rFonts w:ascii="Book Antiqua" w:hAnsi="Book Antiqua"/>
+          <w:sz w:val="28"/>
+          <w:lang w:val="en-US"/>
+        </w:rPr>
+        <w:t>Customer order management.</w:t>
+      </w:r>
     </w:p>
     <w:p>
       <w:pPr>
@@ -1331,7 +2474,15 @@
           <w:sz w:val="28"/>
           <w:lang w:val="en-US"/>
         </w:rPr>
-        <w:t>Sellers Order Registration</w:t>
+        <w:t>Customer</w:t>
+      </w:r>
+      <w:r>
+        <w:rPr>
+          <w:rFonts w:ascii="Book Antiqua" w:hAnsi="Book Antiqua"/>
+          <w:sz w:val="28"/>
+          <w:lang w:val="en-US"/>
+        </w:rPr>
+        <w:t xml:space="preserve"> Order Registration</w:t>
       </w:r>
     </w:p>
     <w:p>
@@ -1353,7 +2504,15 @@
           <w:sz w:val="28"/>
           <w:lang w:val="en-US"/>
         </w:rPr>
-        <w:t>Seller Id</w:t>
+        <w:t>Customer</w:t>
+      </w:r>
+      <w:r>
+        <w:rPr>
+          <w:rFonts w:ascii="Book Antiqua" w:hAnsi="Book Antiqua"/>
+          <w:sz w:val="28"/>
+          <w:lang w:val="en-US"/>
+        </w:rPr>
+        <w:t xml:space="preserve"> Id</w:t>
       </w:r>
     </w:p>
     <w:p>
@@ -1487,6 +2646,22 @@
         </w:rPr>
         <w:t>Status</w:t>
       </w:r>
+      <w:r>
+        <w:rPr>
+          <w:rFonts w:ascii="Book Antiqua" w:hAnsi="Book Antiqua"/>
+          <w:sz w:val="28"/>
+          <w:lang w:val="en-US"/>
+        </w:rPr>
+        <w:t xml:space="preserve"> e.g. “Order confirmed”, “</w:t>
+      </w:r>
+      <w:r>
+        <w:rPr>
+          <w:rFonts w:ascii="Book Antiqua" w:hAnsi="Book Antiqua"/>
+          <w:sz w:val="28"/>
+          <w:lang w:val="en-US"/>
+        </w:rPr>
+        <w:t>Product delivered”.</w:t>
+      </w:r>
     </w:p>
     <w:p>
       <w:pPr>
@@ -1540,38 +2715,88 @@
           <w:lang w:val="en-US"/>
         </w:rPr>
       </w:pPr>
-      <w:r>
-        <w:rPr>
-          <w:rFonts w:ascii="Book Antiqua" w:hAnsi="Book Antiqua"/>
-          <w:sz w:val="28"/>
-          <w:lang w:val="en-US"/>
-        </w:rPr>
-        <w:t>Phase 2: Sellers Side development/Automation.</w:t>
-      </w:r>
-      <w:r>
-        <w:rPr>
-          <w:rFonts w:ascii="Book Antiqua" w:hAnsi="Book Antiqua"/>
-          <w:sz w:val="28"/>
-          <w:lang w:val="en-US"/>
-        </w:rPr>
-        <w:t xml:space="preserve"> (Makes sellers have controlled access to enter their own information and orders)</w:t>
-      </w:r>
-    </w:p>
-    <w:p>
-      <w:pPr>
-        <w:rPr>
-          <w:rFonts w:ascii="Book Antiqua" w:hAnsi="Book Antiqua"/>
-          <w:sz w:val="28"/>
-          <w:lang w:val="en-US"/>
-        </w:rPr>
-      </w:pPr>
-      <w:r>
-        <w:rPr>
-          <w:rFonts w:ascii="Book Antiqua" w:hAnsi="Book Antiqua"/>
-          <w:sz w:val="28"/>
-          <w:lang w:val="en-US"/>
-        </w:rPr>
-        <w:t>Phase 3: Order tracking.</w:t>
+      <w:bookmarkStart w:id="7" w:name="_Toc237592546"/>
+      <w:r>
+        <w:rPr>
+          <w:rStyle w:val="Heading2Char"/>
+          <w:rFonts w:ascii="Book Antiqua" w:hAnsi="Book Antiqua"/>
+        </w:rPr>
+        <w:t>Phase 2:</w:t>
+      </w:r>
+      <w:bookmarkEnd w:id="7"/>
+      <w:r>
+        <w:rPr>
+          <w:rFonts w:ascii="Book Antiqua" w:hAnsi="Book Antiqua"/>
+          <w:sz w:val="32"/>
+          <w:lang w:val="en-US"/>
+        </w:rPr>
+        <w:t xml:space="preserve"> </w:t>
+      </w:r>
+      <w:r>
+        <w:rPr>
+          <w:rFonts w:ascii="Book Antiqua" w:hAnsi="Book Antiqua"/>
+          <w:sz w:val="28"/>
+          <w:lang w:val="en-US"/>
+        </w:rPr>
+        <w:t xml:space="preserve">Enhancements; </w:t>
+      </w:r>
+      <w:r>
+        <w:rPr>
+          <w:rFonts w:ascii="Book Antiqua" w:hAnsi="Book Antiqua"/>
+          <w:sz w:val="28"/>
+          <w:lang w:val="en-US"/>
+        </w:rPr>
+        <w:t>This is where you add extra features that improve the system. e.g.</w:t>
+      </w:r>
+      <w:r>
+        <w:rPr>
+          <w:rFonts w:ascii="Book Antiqua" w:hAnsi="Book Antiqua"/>
+          <w:sz w:val="28"/>
+          <w:lang w:val="en-US"/>
+        </w:rPr>
+        <w:t xml:space="preserve"> Image to items/products.</w:t>
+      </w:r>
+    </w:p>
+    <w:p>
+      <w:pPr>
+        <w:rPr>
+          <w:rFonts w:ascii="Book Antiqua" w:hAnsi="Book Antiqua"/>
+          <w:sz w:val="28"/>
+          <w:lang w:val="en-US"/>
+        </w:rPr>
+      </w:pPr>
+      <w:bookmarkStart w:id="8" w:name="_Toc237592547"/>
+      <w:r>
+        <w:rPr>
+          <w:rStyle w:val="Heading2Char"/>
+          <w:rFonts w:ascii="Book Antiqua" w:hAnsi="Book Antiqua"/>
+        </w:rPr>
+        <w:t>Phase 3:</w:t>
+      </w:r>
+      <w:bookmarkEnd w:id="8"/>
+      <w:r>
+        <w:rPr>
+          <w:rFonts w:ascii="Book Antiqua" w:hAnsi="Book Antiqua"/>
+          <w:sz w:val="32"/>
+          <w:lang w:val="en-US"/>
+        </w:rPr>
+        <w:t xml:space="preserve"> </w:t>
+      </w:r>
+      <w:r>
+        <w:rPr>
+          <w:rFonts w:ascii="Book Antiqua" w:hAnsi="Book Antiqua"/>
+          <w:sz w:val="28"/>
+          <w:lang w:val="en-US"/>
+        </w:rPr>
+        <w:t>Order tracking</w:t>
+      </w:r>
+      <w:r>
+        <w:rPr>
+          <w:rFonts w:ascii="Book Antiqua" w:hAnsi="Book Antiqua"/>
+          <w:sz w:val="28"/>
+          <w:lang w:val="en-US"/>
+        </w:rPr>
+        <w:t>;</w:t>
       </w:r>
       <w:r>
         <w:rPr>
@@ -1590,23 +2815,64 @@
           <w:lang w:val="en-US"/>
         </w:rPr>
       </w:pPr>
-      <w:r>
-        <w:rPr>
-          <w:rFonts w:ascii="Book Antiqua" w:hAnsi="Book Antiqua"/>
-          <w:sz w:val="28"/>
-          <w:lang w:val="en-US"/>
-        </w:rPr>
-        <w:t>Phase 4: Enhancements</w:t>
-      </w:r>
-      <w:bookmarkStart w:id="0" w:name="_GoBack"/>
-      <w:bookmarkEnd w:id="0"/>
-      <w:r>
-        <w:rPr>
-          <w:rFonts w:ascii="Book Antiqua" w:hAnsi="Book Antiqua"/>
-          <w:sz w:val="28"/>
-          <w:lang w:val="en-US"/>
-        </w:rPr>
-        <w:t>; Include Image to items/products.</w:t>
+      <w:bookmarkStart w:id="9" w:name="_Toc237592548"/>
+      <w:r>
+        <w:rPr>
+          <w:rStyle w:val="Heading2Char"/>
+          <w:rFonts w:ascii="Book Antiqua" w:hAnsi="Book Antiqua"/>
+        </w:rPr>
+        <w:t>Phase 4:</w:t>
+      </w:r>
+      <w:bookmarkEnd w:id="9"/>
+      <w:r>
+        <w:rPr>
+          <w:rFonts w:ascii="Book Antiqua" w:hAnsi="Book Antiqua"/>
+          <w:sz w:val="32"/>
+          <w:lang w:val="en-US"/>
+        </w:rPr>
+        <w:t xml:space="preserve"> </w:t>
+      </w:r>
+      <w:r>
+        <w:rPr>
+          <w:rFonts w:ascii="Book Antiqua" w:hAnsi="Book Antiqua"/>
+          <w:sz w:val="28"/>
+          <w:lang w:val="en-US"/>
+        </w:rPr>
+        <w:t>Payment methods.</w:t>
+      </w:r>
+    </w:p>
+    <w:p>
+      <w:pPr>
+        <w:rPr>
+          <w:rFonts w:ascii="Book Antiqua" w:hAnsi="Book Antiqua"/>
+          <w:sz w:val="28"/>
+          <w:lang w:val="en-US"/>
+        </w:rPr>
+      </w:pPr>
+      <w:bookmarkStart w:id="10" w:name="_Toc237592549"/>
+      <w:r>
+        <w:rPr>
+          <w:rStyle w:val="Heading2Char"/>
+          <w:rFonts w:ascii="Book Antiqua" w:hAnsi="Book Antiqua"/>
+        </w:rPr>
+        <w:t>Phase 5:</w:t>
+      </w:r>
+      <w:bookmarkEnd w:id="10"/>
+      <w:r>
+        <w:rPr>
+          <w:rFonts w:ascii="Book Antiqua" w:hAnsi="Book Antiqua"/>
+          <w:sz w:val="32"/>
+          <w:lang w:val="en-US"/>
+        </w:rPr>
+        <w:t xml:space="preserve"> </w:t>
+      </w:r>
+      <w:r>
+        <w:rPr>
+          <w:rFonts w:ascii="Book Antiqua" w:hAnsi="Book Antiqua"/>
+          <w:sz w:val="28"/>
+          <w:lang w:val="en-US"/>
+        </w:rPr>
+        <w:t>Customer Side development/Automation. (Makes customers have controlled access to enter their own information and orders). This is to allow customers to interact with the system. So, this phase is for the implementation of things in phase 1.</w:t>
       </w:r>
     </w:p>
     <w:p>
@@ -1623,7 +2889,6 @@
           <w:rFonts w:ascii="Book Antiqua" w:hAnsi="Book Antiqua"/>
           <w:b/>
           <w:i/>
-          <w:color w:val="FF0000"/>
           <w:sz w:val="28"/>
           <w:u w:val="single"/>
           <w:lang w:val="en-US"/>
@@ -1633,7 +2898,6 @@
       <w:r>
         <w:rPr>
           <w:rFonts w:ascii="Book Antiqua" w:hAnsi="Book Antiqua"/>
-          <w:color w:val="FF0000"/>
           <w:sz w:val="28"/>
           <w:lang w:val="en-US"/>
         </w:rPr>
@@ -1645,12 +2909,20 @@
           <w:sz w:val="28"/>
           <w:lang w:val="en-US"/>
         </w:rPr>
-        <w:t>Phase 2 and 4 can be used interchangeably.</w:t>
+        <w:t>Phase 2 and 4 can be interchange</w:t>
+      </w:r>
+      <w:r>
+        <w:rPr>
+          <w:rFonts w:ascii="Book Antiqua" w:hAnsi="Book Antiqua"/>
+          <w:sz w:val="28"/>
+          <w:lang w:val="en-US"/>
+        </w:rPr>
+        <w:t>d</w:t>
       </w:r>
     </w:p>
     <w:sectPr>
       <w:pgSz w:w="11906" w:h="16838"/>
-      <w:pgMar w:top="851" w:right="1440" w:bottom="1440" w:left="851" w:header="708" w:footer="708" w:gutter="0"/>
+      <w:pgMar w:top="851" w:right="1440" w:bottom="851" w:left="851" w:header="708" w:footer="708" w:gutter="0"/>
       <w:cols w:space="708"/>
       <w:docGrid w:linePitch="360"/>
     </w:sectPr>
@@ -3041,6 +4313,48 @@
       <w:szCs w:val="24"/>
     </w:rPr>
   </w:style>
+  <w:style w:type="paragraph" w:styleId="Heading4">
+    <w:name w:val="heading 4"/>
+    <w:basedOn w:val="Normal"/>
+    <w:next w:val="Normal"/>
+    <w:link w:val="Heading4Char"/>
+    <w:uiPriority w:val="9"/>
+    <w:unhideWhenUsed/>
+    <w:qFormat/>
+    <w:rsid w:val="00413C57"/>
+    <w:pPr>
+      <w:keepNext/>
+      <w:keepLines/>
+      <w:spacing w:before="40" w:after="0"/>
+      <w:outlineLvl w:val="3"/>
+    </w:pPr>
+    <w:rPr>
+      <w:rFonts w:asciiTheme="majorHAnsi" w:eastAsiaTheme="majorEastAsia" w:hAnsiTheme="majorHAnsi" w:cstheme="majorBidi"/>
+      <w:i/>
+      <w:iCs/>
+      <w:color w:val="2F5496" w:themeColor="accent1" w:themeShade="BF"/>
+    </w:rPr>
+  </w:style>
+  <w:style w:type="paragraph" w:styleId="Heading5">
+    <w:name w:val="heading 5"/>
+    <w:basedOn w:val="Normal"/>
+    <w:next w:val="Normal"/>
+    <w:link w:val="Heading5Char"/>
+    <w:uiPriority w:val="9"/>
+    <w:unhideWhenUsed/>
+    <w:qFormat/>
+    <w:rsid w:val="00466DB9"/>
+    <w:pPr>
+      <w:keepNext/>
+      <w:keepLines/>
+      <w:spacing w:before="40" w:after="0"/>
+      <w:outlineLvl w:val="4"/>
+    </w:pPr>
+    <w:rPr>
+      <w:rFonts w:asciiTheme="majorHAnsi" w:eastAsiaTheme="majorEastAsia" w:hAnsiTheme="majorHAnsi" w:cstheme="majorBidi"/>
+      <w:color w:val="2F5496" w:themeColor="accent1" w:themeShade="BF"/>
+    </w:rPr>
+  </w:style>
   <w:style w:type="character" w:default="1" w:styleId="DefaultParagraphFont">
     <w:name w:val="Default Paragraph Font"/>
     <w:uiPriority w:val="1"/>
@@ -3116,6 +4430,163 @@
     <w:pPr>
       <w:ind w:left="720"/>
       <w:contextualSpacing/>
+    </w:pPr>
+  </w:style>
+  <w:style w:type="character" w:customStyle="1" w:styleId="Heading4Char">
+    <w:name w:val="Heading 4 Char"/>
+    <w:basedOn w:val="DefaultParagraphFont"/>
+    <w:link w:val="Heading4"/>
+    <w:uiPriority w:val="9"/>
+    <w:rsid w:val="00413C57"/>
+    <w:rPr>
+      <w:rFonts w:asciiTheme="majorHAnsi" w:eastAsiaTheme="majorEastAsia" w:hAnsiTheme="majorHAnsi" w:cstheme="majorBidi"/>
+      <w:i/>
+      <w:iCs/>
+      <w:color w:val="2F5496" w:themeColor="accent1" w:themeShade="BF"/>
+    </w:rPr>
+  </w:style>
+  <w:style w:type="paragraph" w:styleId="Subtitle">
+    <w:name w:val="Subtitle"/>
+    <w:basedOn w:val="Normal"/>
+    <w:next w:val="Normal"/>
+    <w:link w:val="SubtitleChar"/>
+    <w:uiPriority w:val="11"/>
+    <w:qFormat/>
+    <w:rsid w:val="00413C57"/>
+    <w:pPr>
+      <w:numPr>
+        <w:ilvl w:val="1"/>
+      </w:numPr>
+    </w:pPr>
+    <w:rPr>
+      <w:rFonts w:eastAsiaTheme="minorEastAsia"/>
+      <w:color w:val="5A5A5A" w:themeColor="text1" w:themeTint="A5"/>
+      <w:spacing w:val="15"/>
+    </w:rPr>
+  </w:style>
+  <w:style w:type="character" w:customStyle="1" w:styleId="SubtitleChar">
+    <w:name w:val="Subtitle Char"/>
+    <w:basedOn w:val="DefaultParagraphFont"/>
+    <w:link w:val="Subtitle"/>
+    <w:uiPriority w:val="11"/>
+    <w:rsid w:val="00413C57"/>
+    <w:rPr>
+      <w:rFonts w:eastAsiaTheme="minorEastAsia"/>
+      <w:color w:val="5A5A5A" w:themeColor="text1" w:themeTint="A5"/>
+      <w:spacing w:val="15"/>
+    </w:rPr>
+  </w:style>
+  <w:style w:type="character" w:styleId="SubtleEmphasis">
+    <w:name w:val="Subtle Emphasis"/>
+    <w:basedOn w:val="DefaultParagraphFont"/>
+    <w:uiPriority w:val="19"/>
+    <w:qFormat/>
+    <w:rsid w:val="00413C57"/>
+    <w:rPr>
+      <w:i/>
+      <w:iCs/>
+      <w:color w:val="404040" w:themeColor="text1" w:themeTint="BF"/>
+    </w:rPr>
+  </w:style>
+  <w:style w:type="character" w:customStyle="1" w:styleId="Heading5Char">
+    <w:name w:val="Heading 5 Char"/>
+    <w:basedOn w:val="DefaultParagraphFont"/>
+    <w:link w:val="Heading5"/>
+    <w:uiPriority w:val="9"/>
+    <w:rsid w:val="00466DB9"/>
+    <w:rPr>
+      <w:rFonts w:asciiTheme="majorHAnsi" w:eastAsiaTheme="majorEastAsia" w:hAnsiTheme="majorHAnsi" w:cstheme="majorBidi"/>
+      <w:color w:val="2F5496" w:themeColor="accent1" w:themeShade="BF"/>
+    </w:rPr>
+  </w:style>
+  <w:style w:type="paragraph" w:styleId="TOCHeading">
+    <w:name w:val="TOC Heading"/>
+    <w:basedOn w:val="Heading1"/>
+    <w:next w:val="Normal"/>
+    <w:uiPriority w:val="39"/>
+    <w:unhideWhenUsed/>
+    <w:qFormat/>
+    <w:rsid w:val="00D44409"/>
+    <w:pPr>
+      <w:outlineLvl w:val="9"/>
+    </w:pPr>
+    <w:rPr>
+      <w:lang w:val="en-US"/>
+    </w:rPr>
+  </w:style>
+  <w:style w:type="paragraph" w:styleId="TOC1">
+    <w:name w:val="toc 1"/>
+    <w:basedOn w:val="Normal"/>
+    <w:next w:val="Normal"/>
+    <w:autoRedefine/>
+    <w:uiPriority w:val="39"/>
+    <w:unhideWhenUsed/>
+    <w:rsid w:val="00D44409"/>
+    <w:pPr>
+      <w:spacing w:after="100"/>
+    </w:pPr>
+  </w:style>
+  <w:style w:type="paragraph" w:styleId="TOC2">
+    <w:name w:val="toc 2"/>
+    <w:basedOn w:val="Normal"/>
+    <w:next w:val="Normal"/>
+    <w:autoRedefine/>
+    <w:uiPriority w:val="39"/>
+    <w:unhideWhenUsed/>
+    <w:rsid w:val="00D44409"/>
+    <w:pPr>
+      <w:spacing w:after="100"/>
+      <w:ind w:left="220"/>
+    </w:pPr>
+  </w:style>
+  <w:style w:type="paragraph" w:styleId="TOC3">
+    <w:name w:val="toc 3"/>
+    <w:basedOn w:val="Normal"/>
+    <w:next w:val="Normal"/>
+    <w:autoRedefine/>
+    <w:uiPriority w:val="39"/>
+    <w:unhideWhenUsed/>
+    <w:rsid w:val="00D44409"/>
+    <w:pPr>
+      <w:spacing w:after="100"/>
+      <w:ind w:left="440"/>
+    </w:pPr>
+  </w:style>
+  <w:style w:type="character" w:styleId="Hyperlink">
+    <w:name w:val="Hyperlink"/>
+    <w:basedOn w:val="DefaultParagraphFont"/>
+    <w:uiPriority w:val="99"/>
+    <w:unhideWhenUsed/>
+    <w:rsid w:val="00D44409"/>
+    <w:rPr>
+      <w:color w:val="0563C1" w:themeColor="hyperlink"/>
+      <w:u w:val="single"/>
+    </w:rPr>
+  </w:style>
+  <w:style w:type="paragraph" w:styleId="TOC4">
+    <w:name w:val="toc 4"/>
+    <w:basedOn w:val="Normal"/>
+    <w:next w:val="Normal"/>
+    <w:autoRedefine/>
+    <w:uiPriority w:val="39"/>
+    <w:unhideWhenUsed/>
+    <w:rsid w:val="00421843"/>
+    <w:pPr>
+      <w:spacing w:after="100"/>
+      <w:ind w:left="660"/>
+    </w:pPr>
+  </w:style>
+  <w:style w:type="paragraph" w:styleId="TOC5">
+    <w:name w:val="toc 5"/>
+    <w:basedOn w:val="Normal"/>
+    <w:next w:val="Normal"/>
+    <w:autoRedefine/>
+    <w:uiPriority w:val="39"/>
+    <w:unhideWhenUsed/>
+    <w:rsid w:val="00421843"/>
+    <w:pPr>
+      <w:spacing w:after="100"/>
+      <w:ind w:left="880"/>
     </w:pPr>
   </w:style>
 </w:styles>
@@ -3414,4 +4885,16 @@
     </a:ext>
   </a:extLst>
 </a:theme>
+</file>
+
+<file path=customXml/item1.xml><?xml version="1.0" encoding="utf-8"?>
+<b:Sources xmlns:b="http://schemas.openxmlformats.org/officeDocument/2006/bibliography" xmlns="http://schemas.openxmlformats.org/officeDocument/2006/bibliography" SelectedStyle="\APASixthEditionOfficeOnline.xsl" StyleName="APA" Version="6"/>
+</file>
+
+<file path=customXml/itemProps1.xml><?xml version="1.0" encoding="utf-8"?>
+<ds:datastoreItem xmlns:ds="http://schemas.openxmlformats.org/officeDocument/2006/customXml" ds:itemID="{203D6857-6672-4258-9190-4184A4757016}">
+  <ds:schemaRefs>
+    <ds:schemaRef ds:uri="http://schemas.openxmlformats.org/officeDocument/2006/bibliography"/>
+  </ds:schemaRefs>
+</ds:datastoreItem>
 </file>
</xml_diff>